<commit_message>
Last version of DAIA
</commit_message>
<xml_diff>
--- a/DA, Purposal/Research Document for DA.docx
+++ b/DA, Purposal/Research Document for DA.docx
@@ -170,16 +170,28 @@
       </w:r>
     </w:p>
     <w:p>
-      <w:r>
-        <w:t>Explainable Artificial Intelligence refers to AI systems whose outputs can be understood by humans. The literature distinguishes three useful notions, opaque systems that provide predictions without revealing how inputs become outputs, interpretable systems whose internal mapping from inputs to outputs can be analyzed in mathematical terms, and comprehensible systems that accompany outputs with human-readable symbols or descriptions enabling users to form their own explanations. These notions clarify the types of understanding a forecasting tool can provide to planners and riders.</w:t>
-      </w:r>
-      <w:r>
-        <w:t xml:space="preserve"> </w:t>
-      </w:r>
-    </w:p>
-    <w:p>
       <w:pPr>
         <w:pStyle w:val="Heading3"/>
+        <w:rPr>
+          <w:rFonts w:eastAsiaTheme="minorHAnsi" w:cstheme="minorBidi"/>
+          <w:color w:val="auto"/>
+          <w:sz w:val="24"/>
+          <w:szCs w:val="24"/>
+        </w:rPr>
+      </w:pPr>
+      <w:r>
+        <w:rPr>
+          <w:rFonts w:eastAsiaTheme="minorHAnsi" w:cstheme="minorBidi"/>
+          <w:color w:val="auto"/>
+          <w:sz w:val="24"/>
+          <w:szCs w:val="24"/>
+        </w:rPr>
+        <w:t>Explainable Artificial Intelligence means AI whose outputs can be understood by humans, with the literature distinguishing opaque systems that do not reveal how inputs become outputs, interpretable systems whose internal mapping can be analyzed, and comprehensible systems that provide human-readable cues users can reason with.</w:t>
+      </w:r>
+    </w:p>
+    <w:p>
+      <w:pPr>
+        <w:pStyle w:val="Heading3"/>
       </w:pPr>
       <w:r>
         <w:t>2.2 Why explanations matter in public mobility</w:t>
@@ -187,13 +199,10 @@
     </w:p>
     <w:p>
       <w:r>
-        <w:t xml:space="preserve">Forecasts influence resource allocation, maintenance scheduling, and rider experience, therefore stakeholders need clarity about which observed factors shaped a given daily prediction and why the outcome differs from typical conditions. In European policy, this aligns with Trustworthy AI guidance that emphasizes transparency, human oversight, robustness, privacy and data governance, fairness, societal well-being, and accountability across the AI lifecycle. </w:t>
-      </w:r>
-      <w:r>
-        <w:t>These rules mean we must clearly explain which factors caused each day’s bike-rental prediction in public services.</w:t>
-      </w:r>
-      <w:r>
-        <w:t xml:space="preserve"> </w:t>
+        <w:t xml:space="preserve">Forecasts influence resource allocation, maintenance scheduling, and rider experience, therefore stakeholders need clarity about which observed factors shaped a given daily prediction and why the outcome differs from typical conditions. </w:t>
+      </w:r>
+      <w:r>
+        <w:t>In European policy this aligns with Trustworthy AI guidance that emphasizes transparency and human oversight across the lifecycle, which, for this setting, means being clear about which factors shaped each day’s forecast and why it differs from typical conditions.</w:t>
       </w:r>
     </w:p>
     <w:p>
@@ -310,27 +319,26 @@
       </w:r>
       <w:r>
         <w:br/>
-        <w:t xml:space="preserve">This question targets day-to-day variation rather than intraday patterns, because operators plan redistribution and maintenance on a daily cadence, and major public </w:t>
+      </w:r>
+      <w:r>
+        <w:t>This question targets day-to-day variation rather than intraday patterns, because operators plan redistribution and maintenance on a daily cadence.</w:t>
+      </w:r>
+    </w:p>
+    <w:p>
+      <w:pPr>
+        <w:pStyle w:val="Heading3"/>
+      </w:pPr>
+      <w:r>
+        <w:t>3.2 What I do, planned analysis activities</w:t>
+      </w:r>
+    </w:p>
+    <w:p>
+      <w:r>
+        <w:t xml:space="preserve">This study synthesizes academic and practitioner evidence to identify measurable daily drivers of bike-rental demand, focusing on weather and calendar conditions that are </w:t>
       </w:r>
       <w:r>
         <w:lastRenderedPageBreak/>
-        <w:t>datasets, including the Washington, D.C. example used in this study, record rentals and weather at a daily level.</w:t>
-      </w:r>
-      <w:r>
-        <w:t xml:space="preserve"> </w:t>
-      </w:r>
-    </w:p>
-    <w:p>
-      <w:pPr>
-        <w:pStyle w:val="Heading3"/>
-      </w:pPr>
-      <w:r>
-        <w:t>3.2 What I do, planned analysis activities</w:t>
-      </w:r>
-    </w:p>
-    <w:p>
-      <w:r>
-        <w:t xml:space="preserve">This study synthesizes academic and practitioner evidence to identify measurable daily drivers of bike-rental demand, focusing on weather and calendar conditions that are observable before the operating day. </w:t>
+        <w:t xml:space="preserve">observable before the operating day. </w:t>
       </w:r>
       <w:r>
         <w:t>The analysis combines library research on cycling and bikeshare demand with practitioner guidance on system operations, then organizes drivers into weather and calendar categories to inform data requirements for a later modeling phase.</w:t>
@@ -471,14 +479,35 @@
         <w:t>Holidays and large events</w:t>
       </w:r>
       <w:r>
-        <w:t xml:space="preserve"> can shift volumes away from typical weekday profiles, so daily holiday indicators and event flags are useful where available. </w:t>
+        <w:t xml:space="preserve"> can shift volumes away from typical weekday profiles, so daily holiday indicators and event flags are useful where available. These calendar variables are deterministic and easy to generate once the analysis period is defined.</w:t>
+      </w:r>
+      <w:r>
+        <w:t xml:space="preserve"> </w:t>
+      </w:r>
+    </w:p>
+    <w:p>
+      <w:pPr>
+        <w:pStyle w:val="Heading3"/>
+      </w:pPr>
+      <w:r>
+        <w:t>3.5 Interim summary of domain insights</w:t>
+      </w:r>
+    </w:p>
+    <w:p>
+      <w:r>
+        <w:t xml:space="preserve">At a daily horizon the most consistent observable drivers are weather and calendar structure, specifically temperature, precipitation, wind, season or month, weekday, </w:t>
       </w:r>
       <w:r>
         <w:lastRenderedPageBreak/>
-        <w:t>These calendar variables are deterministic and easy to generate once the analysis period is defined.</w:t>
-      </w:r>
-      <w:r>
-        <w:t xml:space="preserve"> </w:t>
+        <w:t>and optional holiday or event indicators, which are measurable before operations begin and map directly to redistribution and maintenance decisions.</w:t>
+      </w:r>
+    </w:p>
+    <w:p>
+      <w:pPr>
+        <w:pStyle w:val="Heading2"/>
+      </w:pPr>
+      <w:r>
+        <w:t>4. Explainable AI in This Project, Stakeholders and Use Cases</w:t>
       </w:r>
     </w:p>
     <w:p>
@@ -486,257 +515,260 @@
         <w:pStyle w:val="Heading3"/>
       </w:pPr>
       <w:r>
-        <w:t>3.5 Interim summary of domain insights</w:t>
-      </w:r>
-    </w:p>
-    <w:p>
-      <w:r>
-        <w:t>At a daily horizon, the most consistent observable drivers are weather and seasonality, specifically temperature, precipitation, wind, and the seasonal or monthly context, complemented by weekday effects and optional holiday or event indicators. These drivers are measurable before operations begin, they are recorded or derivable at daily granularity, and they map directly to decisions that Dutch operators and planners must take for redistribution and maintenance. This evidence-based understanding will be used to define data requirements for a later modeling phase, ensuring that features reflect real-world mechanisms rather than algorithmic convenience.</w:t>
-      </w:r>
-      <w:r>
-        <w:t xml:space="preserve"> </w:t>
-      </w:r>
-    </w:p>
-    <w:p/>
-    <w:p>
-      <w:pPr>
-        <w:pStyle w:val="Heading2"/>
-      </w:pPr>
-      <w:r>
-        <w:t>4. Explainable AI in This Project, Stakeholders and Use Cases</w:t>
+        <w:t>4.1 Company perspective, operations, planning, maintenance</w:t>
       </w:r>
     </w:p>
     <w:p>
       <w:pPr>
         <w:pStyle w:val="Heading3"/>
-      </w:pPr>
-      <w:r>
-        <w:t>4.1 Company perspective, operations, planning, maintenance</w:t>
-      </w:r>
-    </w:p>
-    <w:p>
-      <w:r>
-        <w:t>Daily forecasts support company teams in planning bike movements, staff allocation, and maintenance activities without reducing availability. Explanations clarify which observable factors, such as temperature, precipitation, and weekday, influenced the forecast and how it compares to a typical day in similar conditions. These insights help operators improve redistribution planning, shift organization, and maintenance scheduling. Industry guidelines highlight that anticipatory planning becomes more effective when forecasts are transparent and easy to interpret</w:t>
+        <w:rPr>
+          <w:rFonts w:eastAsiaTheme="minorHAnsi" w:cstheme="minorBidi"/>
+          <w:color w:val="auto"/>
+          <w:sz w:val="24"/>
+          <w:szCs w:val="24"/>
+        </w:rPr>
+      </w:pPr>
+      <w:r>
+        <w:rPr>
+          <w:rFonts w:eastAsiaTheme="minorHAnsi" w:cstheme="minorBidi"/>
+          <w:color w:val="auto"/>
+          <w:sz w:val="24"/>
+          <w:szCs w:val="24"/>
+        </w:rPr>
+        <w:t>Daily forecasts support company teams in planning bike movements, staff allocation, and maintenance activities without reducing availability. Short factor summaries, for example expected temperature, precipitation, wind, season, and weekday, show why tomorrow may differ from a typical peer day and help improve redistribution planning, shift organization, and maintenance scheduling. Add brief what-if lines, for example how stronger rain or calmer wind would change expected demand, so planners can act proactively.</w:t>
+      </w:r>
+    </w:p>
+    <w:p>
+      <w:pPr>
+        <w:pStyle w:val="Heading3"/>
+      </w:pPr>
+      <w:r>
+        <w:t>4.2 Customer perspective, rider experience and communication</w:t>
+      </w:r>
+    </w:p>
+    <w:p>
+      <w:pPr>
+        <w:pStyle w:val="Heading3"/>
+        <w:rPr>
+          <w:rFonts w:eastAsiaTheme="minorHAnsi" w:cstheme="minorBidi"/>
+          <w:color w:val="auto"/>
+          <w:sz w:val="24"/>
+          <w:szCs w:val="24"/>
+        </w:rPr>
+      </w:pPr>
+      <w:r>
+        <w:rPr>
+          <w:rFonts w:eastAsiaTheme="minorHAnsi" w:cstheme="minorBidi"/>
+          <w:color w:val="auto"/>
+          <w:sz w:val="24"/>
+          <w:szCs w:val="24"/>
+        </w:rPr>
+        <w:t>Although this project does not directly communicate with riders, improved operational decisions enhance customer experience indirectly. Clear daily forecasts with factor summaries lead to more consistent availability, and later the same summaries could support user messages such as expected high-demand periods or suggested alternative stations.</w:t>
+      </w:r>
+    </w:p>
+    <w:p>
+      <w:pPr>
+        <w:pStyle w:val="Heading3"/>
+      </w:pPr>
+      <w:r>
+        <w:t>4.</w:t>
+      </w:r>
+      <w:r>
+        <w:t>3</w:t>
+      </w:r>
+      <w:r>
+        <w:t xml:space="preserve"> Trustworthy and transparent AI applied to decisions in this context</w:t>
+      </w:r>
+    </w:p>
+    <w:p>
+      <w:pPr>
+        <w:rPr>
+          <w:rFonts w:eastAsiaTheme="majorEastAsia" w:cstheme="majorBidi"/>
+          <w:color w:val="0F4761" w:themeColor="accent1" w:themeShade="BF"/>
+          <w:sz w:val="28"/>
+          <w:szCs w:val="28"/>
+        </w:rPr>
+      </w:pPr>
+      <w:r>
+        <w:t xml:space="preserve">This project does </w:t>
       </w:r>
       <w:r>
         <w:rPr>
           <w:b/>
           <w:bCs/>
         </w:rPr>
-        <w:t xml:space="preserve">. </w:t>
-      </w:r>
-    </w:p>
-    <w:p>
-      <w:pPr>
-        <w:pStyle w:val="Heading3"/>
-      </w:pPr>
-      <w:r>
-        <w:t>4.2 Customer perspective, rider experience and communication</w:t>
-      </w:r>
-    </w:p>
-    <w:p>
-      <w:r>
-        <w:t>Although this project does not directly communicate with riders, improved operational decisions can enhance customer experience indirectly. When operators use clear and explainable forecasts, bike availability becomes more consistent, and users benefit from a more reliable service. In later applications, forecast insights could also support user-facing communication, such as informing about expected high-demand periods or alternative stations.</w:t>
-      </w:r>
-      <w:r>
-        <w:t xml:space="preserve"> </w:t>
-      </w:r>
-    </w:p>
-    <w:p>
-      <w:pPr>
-        <w:pStyle w:val="Heading3"/>
-      </w:pPr>
-      <w:r>
-        <w:t>4.3 Explanation formats, factor influence summaries, scenario narratives</w:t>
-      </w:r>
-    </w:p>
-    <w:p>
-      <w:r>
-        <w:t>For operational use, simple explanation formats are most useful. A daily summary can list key factors like temperature, rain, wind, and calendar effects, along with a short note comparing tomorrow’s forecast to a normal day. For planners and managers, scenario-based summaries</w:t>
-      </w:r>
-      <w:r>
-        <w:t xml:space="preserve">, </w:t>
-      </w:r>
-      <w:r>
-        <w:t>such as how stronger rain or calmer wind could affect demand</w:t>
-      </w:r>
-      <w:r>
-        <w:t xml:space="preserve">, </w:t>
-      </w:r>
-      <w:r>
-        <w:t>support proactive planning. These formats align with the goal of Explainable AI: helping users understand, trust, and manage AI-assisted decisions appropriately.</w:t>
-      </w:r>
-      <w:r>
-        <w:t xml:space="preserve"> </w:t>
-      </w:r>
-    </w:p>
-    <w:p>
-      <w:pPr>
-        <w:pStyle w:val="Heading3"/>
-      </w:pPr>
-      <w:r>
-        <w:lastRenderedPageBreak/>
-        <w:t>4.4 Trustworthy and transparent AI applied to decisions in this context</w:t>
-      </w:r>
-    </w:p>
-    <w:p>
-      <w:r>
-        <w:t>Because this project provides decision support for operational teams, it applies a minimal set of explanation principles aligned with European Trustworthy AI guidance. These include transparency about which factors shaped each forecast, human oversight when interpreting results, documentation of assumptions and known limits, and fairness checks where relevant. These principles help ensure that explanations remain both technically clear and accountable within the operator’s workflow.</w:t>
-      </w:r>
-      <w:r>
-        <w:t xml:space="preserve"> </w:t>
-      </w:r>
-    </w:p>
-    <w:p>
-      <w:pPr>
-        <w:pStyle w:val="Heading2"/>
-      </w:pPr>
-      <w:r>
-        <w:t>5. Data Requirements</w:t>
-      </w:r>
-      <w:r>
-        <w:t xml:space="preserve"> Based On</w:t>
-      </w:r>
-      <w:r>
-        <w:t xml:space="preserve"> Domain</w:t>
-      </w:r>
-    </w:p>
-    <w:p>
-      <w:pPr>
-        <w:pStyle w:val="Heading3"/>
-      </w:pPr>
-      <w:r>
-        <w:t>5.1 Target definition, daily total rentals</w:t>
-      </w:r>
-    </w:p>
-    <w:p>
-      <w:r>
-        <w:t xml:space="preserve">The target variable in this study is the </w:t>
+        <w:t>not</w:t>
+      </w:r>
+      <w:r>
+        <w:t xml:space="preserve"> generate automated explanations. Its role is to support planners and operators with </w:t>
       </w:r>
       <w:r>
         <w:rPr>
           <w:b/>
           <w:bCs/>
         </w:rPr>
-        <w:t>daily total number of bike rentals</w:t>
-      </w:r>
-      <w:r>
-        <w:t xml:space="preserve"> recorded by the system. This approach follows how most public bike-share datasets and operator reports group usage data together with weather and calendar information on a daily basis. Focusing on daily totals keeps the prediction timeline aligned with real operational decisions, such as planning bike redistribution and scheduling maintenance for the next day</w:t>
-      </w:r>
-      <w:r>
-        <w:t>.</w:t>
-      </w:r>
-      <w:r>
-        <w:t xml:space="preserve"> </w:t>
-      </w:r>
-    </w:p>
-    <w:p>
-      <w:pPr>
-        <w:pStyle w:val="Heading3"/>
-      </w:pPr>
-      <w:r>
-        <w:t>5.2 Input variables, daily weather and calendar features, optional operational signals</w:t>
-      </w:r>
-    </w:p>
-    <w:p>
-      <w:r>
-        <w:t xml:space="preserve">Daily weather features such as </w:t>
+        <w:t>daily forecasts</w:t>
+      </w:r>
+      <w:r>
+        <w:t xml:space="preserve"> and simple </w:t>
       </w:r>
       <w:r>
         <w:rPr>
           <w:b/>
           <w:bCs/>
         </w:rPr>
-        <w:t>temperature</w:t>
-      </w:r>
-      <w:r>
-        <w:t xml:space="preserve">, </w:t>
+        <w:t>factor summaries</w:t>
+      </w:r>
+      <w:r>
+        <w:t xml:space="preserve"> such as expected temperature, rain, wind, season, and weekday so they can judge staffing, redistribution, and maintenance needs. At the design stage, the work </w:t>
       </w:r>
       <w:r>
         <w:rPr>
           <w:b/>
           <w:bCs/>
         </w:rPr>
-        <w:t>rainfall</w:t>
-      </w:r>
-      <w:r>
-        <w:t xml:space="preserve">, </w:t>
+        <w:t>aligns</w:t>
+      </w:r>
+      <w:r>
+        <w:t xml:space="preserve"> with widely used principles for trustworthy AI being clear about inputs used, documenting assumptions and limits, and keeping humans in the loop for all operational decisions without implementing an explanation module. This keeps the output practical for day-ahead planning while leaving room to add formal explainability later if required.</w:t>
+      </w:r>
+    </w:p>
+    <w:p>
+      <w:pPr>
+        <w:pStyle w:val="Heading2"/>
+      </w:pPr>
+      <w:r>
+        <w:t>5. Data Requirements</w:t>
+      </w:r>
+      <w:r>
+        <w:t xml:space="preserve"> Based On</w:t>
+      </w:r>
+      <w:r>
+        <w:t xml:space="preserve"> Domain</w:t>
+      </w:r>
+    </w:p>
+    <w:p>
+      <w:pPr>
+        <w:pStyle w:val="Heading3"/>
+      </w:pPr>
+      <w:r>
+        <w:t>5.1 Target definition, daily total rentals</w:t>
+      </w:r>
+    </w:p>
+    <w:p>
+      <w:r>
+        <w:t xml:space="preserve">The target variable in this study is the </w:t>
       </w:r>
       <w:r>
         <w:rPr>
           <w:b/>
           <w:bCs/>
         </w:rPr>
-        <w:t>wind speed</w:t>
-      </w:r>
-      <w:r>
-        <w:t xml:space="preserve">, and </w:t>
+        <w:t>daily total number of bike rentals</w:t>
+      </w:r>
+      <w:r>
+        <w:t xml:space="preserve"> recorded by the system. This approach follows how most public bike-share datasets and operator reports group usage data together with weather and calendar information on a daily basis. Focusing on daily totals keeps the prediction timeline aligned with real operational decisions, such as planning bike redistribution and scheduling maintenance for the next day</w:t>
+      </w:r>
+      <w:r>
+        <w:t>.</w:t>
+      </w:r>
+      <w:r>
+        <w:t xml:space="preserve"> </w:t>
+      </w:r>
+    </w:p>
+    <w:p>
+      <w:pPr>
+        <w:pStyle w:val="Heading3"/>
+      </w:pPr>
+      <w:r>
+        <w:lastRenderedPageBreak/>
+        <w:t>5.2 Input variables, daily weather and calendar features, optional operational signals</w:t>
+      </w:r>
+    </w:p>
+    <w:p>
+      <w:pPr>
+        <w:pStyle w:val="Heading3"/>
+        <w:rPr>
+          <w:rFonts w:eastAsiaTheme="minorHAnsi" w:cstheme="minorBidi"/>
+          <w:color w:val="auto"/>
+          <w:sz w:val="24"/>
+          <w:szCs w:val="24"/>
+        </w:rPr>
+      </w:pPr>
+      <w:r>
+        <w:rPr>
+          <w:rFonts w:eastAsiaTheme="minorHAnsi" w:cstheme="minorBidi"/>
+          <w:color w:val="auto"/>
+          <w:sz w:val="24"/>
+          <w:szCs w:val="24"/>
+        </w:rPr>
+        <w:t>Daily weather features such as temperature, rainfall, wind speed, and humidity are key factors that affect cycling activity and are available from national weather services. Calendar features like season, month, and weekday capture climate cycles and travel habits, while holiday or event flags explain unusual days. Optional operational data, such as available bikes, docks, or maintenance times, can help separate real demand changes from supply limits when available.</w:t>
+      </w:r>
+    </w:p>
+    <w:p>
+      <w:pPr>
+        <w:pStyle w:val="Heading3"/>
+      </w:pPr>
+      <w:r>
+        <w:t>5.3 Granularity and time span, daily aggregation and seasonal coverage</w:t>
+      </w:r>
+    </w:p>
+    <w:p>
+      <w:r>
+        <w:t xml:space="preserve">All inputs should be </w:t>
       </w:r>
       <w:r>
         <w:rPr>
           <w:b/>
           <w:bCs/>
         </w:rPr>
-        <w:t>humidity</w:t>
-      </w:r>
-      <w:r>
-        <w:t xml:space="preserve"> are key factors that affect cycling activity and can be taken from national weather services. Calendar features like </w:t>
+        <w:t>aggregated or sourced at daily granularity</w:t>
+      </w:r>
+      <w:r>
+        <w:t xml:space="preserve"> to match the target. The training period should cover </w:t>
       </w:r>
       <w:r>
         <w:rPr>
           <w:b/>
           <w:bCs/>
         </w:rPr>
-        <w:t>season</w:t>
-      </w:r>
-      <w:r>
-        <w:t xml:space="preserve">, </w:t>
+        <w:t>at least one full annual cycle</w:t>
+      </w:r>
+      <w:r>
+        <w:t xml:space="preserve"> to expose the model and explanations to seasonal variation. If possible, include two years to improve robustness of seasonality estimates and to support simple out-of-time validation at the daily level. </w:t>
+      </w:r>
+    </w:p>
+    <w:p>
+      <w:pPr>
+        <w:pStyle w:val="Heading3"/>
+      </w:pPr>
+      <w:r>
+        <w:t>5.4 Data quality and governance, units, missing values</w:t>
+      </w:r>
+    </w:p>
+    <w:p>
+      <w:r>
+        <w:t xml:space="preserve">Define </w:t>
       </w:r>
       <w:r>
         <w:rPr>
           <w:b/>
           <w:bCs/>
         </w:rPr>
-        <w:t>month</w:t>
-      </w:r>
-      <w:r>
-        <w:t>, and weekday capture climate cycles and travel habits, while holiday or event flags explain unusual days. Optional operational data, such as available bikes, docks, or maintenance times, can help separate real demand changes from supply limits when available.</w:t>
-      </w:r>
-      <w:r>
-        <w:t xml:space="preserve">. </w:t>
-      </w:r>
-    </w:p>
-    <w:p>
-      <w:pPr>
-        <w:pStyle w:val="Heading3"/>
-      </w:pPr>
-      <w:r>
-        <w:t>5.3 Granularity and time span, daily aggregation and seasonal coverage</w:t>
-      </w:r>
-    </w:p>
-    <w:p>
-      <w:r>
-        <w:t xml:space="preserve">All inputs should be </w:t>
+        <w:t>units and encoding</w:t>
+      </w:r>
+      <w:r>
+        <w:t xml:space="preserve"> up front, for example temperature in degrees Celsius, precipitation in millimeters per day, wind speed in meters per second, and calendar variables as categorical features. Specify a </w:t>
       </w:r>
       <w:r>
         <w:rPr>
           <w:b/>
           <w:bCs/>
         </w:rPr>
-        <w:t>aggregated or sourced at daily granularity</w:t>
-      </w:r>
-      <w:r>
-        <w:t xml:space="preserve"> to match the target. The training period should cover </w:t>
-      </w:r>
-      <w:r>
-        <w:rPr>
-          <w:b/>
-          <w:bCs/>
-        </w:rPr>
-        <w:t>at least one full annual cycle</w:t>
-      </w:r>
-      <w:r>
-        <w:t xml:space="preserve"> to expose the model and explanations to seasonal variation. If possible, include two years to improve robustness of seasonality estimates and to support simple out-of-time validation at the daily level. </w:t>
+        <w:t>missing-value policy</w:t>
+      </w:r>
+      <w:r>
+        <w:t xml:space="preserve"> for weather and target fields, for example drop days with missing target. </w:t>
       </w:r>
     </w:p>
     <w:p>
@@ -744,40 +776,6 @@
         <w:pStyle w:val="Heading3"/>
       </w:pPr>
       <w:r>
-        <w:t>5.4 Data quality and governance, units, missing values</w:t>
-      </w:r>
-    </w:p>
-    <w:p>
-      <w:r>
-        <w:t xml:space="preserve">Define </w:t>
-      </w:r>
-      <w:r>
-        <w:rPr>
-          <w:b/>
-          <w:bCs/>
-        </w:rPr>
-        <w:t>units and encoding</w:t>
-      </w:r>
-      <w:r>
-        <w:t xml:space="preserve"> up front, for example temperature in degrees Celsius, precipitation in millimeters per day, wind speed in meters per second, and calendar variables as categorical features. Specify a </w:t>
-      </w:r>
-      <w:r>
-        <w:rPr>
-          <w:b/>
-          <w:bCs/>
-        </w:rPr>
-        <w:t>missing-value policy</w:t>
-      </w:r>
-      <w:r>
-        <w:t xml:space="preserve"> for weather and target fields, for example drop days with missing target. </w:t>
-      </w:r>
-    </w:p>
-    <w:p>
-      <w:pPr>
-        <w:pStyle w:val="Heading3"/>
-      </w:pPr>
-      <w:r>
-        <w:lastRenderedPageBreak/>
         <w:t>5.5 Candidate data sources, to be confirmed later</w:t>
       </w:r>
     </w:p>
@@ -883,7 +881,11 @@
         <w:t>library research</w:t>
       </w:r>
       <w:r>
-        <w:t xml:space="preserve"> to review academic and practitioner sources on bike-rental forecasting and Explainable AI, ensuring a strong theoretical foundation. I carried out a </w:t>
+        <w:t xml:space="preserve"> to review academic </w:t>
+      </w:r>
+      <w:r>
+        <w:lastRenderedPageBreak/>
+        <w:t xml:space="preserve">and practitioner sources on bike-rental forecasting and Explainable AI, ensuring a strong theoretical foundation. I carried out a </w:t>
       </w:r>
       <w:r>
         <w:rPr>
@@ -947,7 +949,7 @@
       <w:r>
         <w:t xml:space="preserve"> </w:t>
       </w:r>
-      <w:hyperlink r:id="rId5" w:tgtFrame="_new" w:history="1">
+      <w:hyperlink r:id="rId6" w:tgtFrame="_new" w:history="1">
         <w:r>
           <w:rPr>
             <w:rStyle w:val="Hyperlink"/>
@@ -986,7 +988,7 @@
       <w:r>
         <w:t xml:space="preserve"> </w:t>
       </w:r>
-      <w:hyperlink r:id="rId6" w:history="1">
+      <w:hyperlink r:id="rId7" w:history="1">
         <w:r>
           <w:rPr>
             <w:rStyle w:val="Hyperlink"/>
@@ -1028,7 +1030,7 @@
       <w:r>
         <w:t xml:space="preserve"> </w:t>
       </w:r>
-      <w:hyperlink r:id="rId7" w:history="1">
+      <w:hyperlink r:id="rId8" w:history="1">
         <w:r>
           <w:rPr>
             <w:rStyle w:val="Hyperlink"/>
@@ -1067,7 +1069,7 @@
       <w:r>
         <w:t xml:space="preserve"> </w:t>
       </w:r>
-      <w:hyperlink r:id="rId8" w:history="1">
+      <w:hyperlink r:id="rId9" w:history="1">
         <w:r>
           <w:rPr>
             <w:rStyle w:val="Hyperlink"/>
@@ -1084,7 +1086,6 @@
         </w:numPr>
       </w:pPr>
       <w:r>
-        <w:lastRenderedPageBreak/>
         <w:t xml:space="preserve">KNMI — Royal Netherlands Meteorological Institute. </w:t>
       </w:r>
       <w:r>
@@ -1107,7 +1108,7 @@
       <w:r>
         <w:t xml:space="preserve"> </w:t>
       </w:r>
-      <w:hyperlink r:id="rId9" w:tgtFrame="_new" w:history="1">
+      <w:hyperlink r:id="rId10" w:tgtFrame="_new" w:history="1">
         <w:r>
           <w:rPr>
             <w:rStyle w:val="Hyperlink"/>
@@ -1146,7 +1147,7 @@
       <w:r>
         <w:t xml:space="preserve"> </w:t>
       </w:r>
-      <w:hyperlink r:id="rId10" w:tgtFrame="_new" w:history="1">
+      <w:hyperlink r:id="rId11" w:tgtFrame="_new" w:history="1">
         <w:r>
           <w:rPr>
             <w:rStyle w:val="Hyperlink"/>
@@ -1175,7 +1176,7 @@
       <w:r>
         <w:t xml:space="preserve"> (planning, redistribution, service levels). </w:t>
       </w:r>
-      <w:hyperlink r:id="rId11" w:tgtFrame="_blank" w:history="1">
+      <w:hyperlink r:id="rId12" w:tgtFrame="_blank" w:history="1">
         <w:r>
           <w:rPr>
             <w:rStyle w:val="Hyperlink"/>
@@ -1214,7 +1215,7 @@
       <w:r>
         <w:t xml:space="preserve"> </w:t>
       </w:r>
-      <w:hyperlink r:id="rId12" w:history="1">
+      <w:hyperlink r:id="rId13" w:history="1">
         <w:r>
           <w:rPr>
             <w:rStyle w:val="Hyperlink"/>
@@ -1253,7 +1254,7 @@
       <w:r>
         <w:t xml:space="preserve"> </w:t>
       </w:r>
-      <w:hyperlink r:id="rId13" w:tgtFrame="_new" w:history="1">
+      <w:hyperlink r:id="rId14" w:tgtFrame="_new" w:history="1">
         <w:r>
           <w:rPr>
             <w:rStyle w:val="Hyperlink"/>
@@ -1295,7 +1296,7 @@
       <w:r>
         <w:t xml:space="preserve"> </w:t>
       </w:r>
-      <w:hyperlink r:id="rId14" w:tgtFrame="_new" w:history="1">
+      <w:hyperlink r:id="rId15" w:tgtFrame="_new" w:history="1">
         <w:r>
           <w:rPr>
             <w:rStyle w:val="Hyperlink"/>
@@ -1334,7 +1335,7 @@
       <w:r>
         <w:t xml:space="preserve"> </w:t>
       </w:r>
-      <w:hyperlink r:id="rId15" w:history="1">
+      <w:hyperlink r:id="rId16" w:history="1">
         <w:r>
           <w:rPr>
             <w:rStyle w:val="Hyperlink"/>
@@ -1366,7 +1367,7 @@
       <w:r>
         <w:t xml:space="preserve"> </w:t>
       </w:r>
-      <w:hyperlink r:id="rId16" w:tgtFrame="_new" w:history="1">
+      <w:hyperlink r:id="rId17" w:tgtFrame="_new" w:history="1">
         <w:r>
           <w:rPr>
             <w:rStyle w:val="Hyperlink"/>
@@ -1383,6 +1384,7 @@
         </w:numPr>
       </w:pPr>
       <w:r>
+        <w:lastRenderedPageBreak/>
         <w:t xml:space="preserve">SpringerLink — transportation research used for Dutch cycling demand studies. </w:t>
       </w:r>
       <w:r>
@@ -1395,7 +1397,7 @@
       <w:r>
         <w:t xml:space="preserve"> </w:t>
       </w:r>
-      <w:hyperlink r:id="rId17" w:history="1">
+      <w:hyperlink r:id="rId18" w:history="1">
         <w:r>
           <w:rPr>
             <w:rStyle w:val="Hyperlink"/>
@@ -5568,6 +5570,52 @@
       <w:noProof/>
     </w:rPr>
   </w:style>
+  <w:style w:type="paragraph" w:styleId="TOCHeading">
+    <w:name w:val="TOC Heading"/>
+    <w:basedOn w:val="Heading1"/>
+    <w:next w:val="Normal"/>
+    <w:uiPriority w:val="39"/>
+    <w:unhideWhenUsed/>
+    <w:qFormat/>
+    <w:rsid w:val="00BB3D65"/>
+    <w:pPr>
+      <w:spacing w:before="240" w:after="0" w:line="259" w:lineRule="auto"/>
+      <w:outlineLvl w:val="9"/>
+    </w:pPr>
+    <w:rPr>
+      <w:noProof w:val="0"/>
+      <w:sz w:val="32"/>
+      <w:szCs w:val="32"/>
+      <w:lang w:val="en-US"/>
+      <w14:ligatures w14:val="none"/>
+    </w:rPr>
+  </w:style>
+  <w:style w:type="paragraph" w:styleId="TOC2">
+    <w:name w:val="toc 2"/>
+    <w:basedOn w:val="Normal"/>
+    <w:next w:val="Normal"/>
+    <w:autoRedefine/>
+    <w:uiPriority w:val="39"/>
+    <w:unhideWhenUsed/>
+    <w:rsid w:val="00BB3D65"/>
+    <w:pPr>
+      <w:spacing w:after="100"/>
+      <w:ind w:left="240"/>
+    </w:pPr>
+  </w:style>
+  <w:style w:type="paragraph" w:styleId="TOC3">
+    <w:name w:val="toc 3"/>
+    <w:basedOn w:val="Normal"/>
+    <w:next w:val="Normal"/>
+    <w:autoRedefine/>
+    <w:uiPriority w:val="39"/>
+    <w:unhideWhenUsed/>
+    <w:rsid w:val="00BB3D65"/>
+    <w:pPr>
+      <w:spacing w:after="100"/>
+      <w:ind w:left="480"/>
+    </w:pPr>
+  </w:style>
 </w:styles>
 </file>
 
@@ -5864,4 +5912,16 @@
     </a:ext>
   </a:extLst>
 </a:theme>
+</file>
+
+<file path=customXml/item1.xml><?xml version="1.0" encoding="utf-8"?>
+<b:Sources xmlns:b="http://schemas.openxmlformats.org/officeDocument/2006/bibliography" xmlns="http://schemas.openxmlformats.org/officeDocument/2006/bibliography" SelectedStyle="\APASixthEditionOfficeOnline.xsl" StyleName="APA" Version="6"/>
+</file>
+
+<file path=customXml/itemProps1.xml><?xml version="1.0" encoding="utf-8"?>
+<ds:datastoreItem xmlns:ds="http://schemas.openxmlformats.org/officeDocument/2006/customXml" ds:itemID="{ED16033E-1B7C-4CC9-B610-437FF9B43714}">
+  <ds:schemaRefs>
+    <ds:schemaRef ds:uri="http://schemas.openxmlformats.org/officeDocument/2006/bibliography"/>
+  </ds:schemaRefs>
+</ds:datastoreItem>
 </file>
</xml_diff>

<commit_message>
Research document and opportunities and limitations document done
</commit_message>
<xml_diff>
--- a/DA, Purposal/Research Document for DA.docx
+++ b/DA, Purposal/Research Document for DA.docx
@@ -5,27 +5,1753 @@
     <w:p>
       <w:pPr>
         <w:pStyle w:val="Title"/>
-      </w:pPr>
-      <w:r>
-        <w:t>Research Document — Domain Understanding &amp; Explainable AI</w:t>
+        <w:rPr>
+          <w:sz w:val="48"/>
+          <w:szCs w:val="48"/>
+        </w:rPr>
+      </w:pPr>
+      <w:r>
+        <w:rPr>
+          <w:sz w:val="48"/>
+          <w:szCs w:val="48"/>
+        </w:rPr>
+        <w:t xml:space="preserve">Research Document </w:t>
+      </w:r>
+      <w:r>
+        <w:rPr>
+          <w:sz w:val="48"/>
+          <w:szCs w:val="48"/>
+        </w:rPr>
+        <w:t>(</w:t>
+      </w:r>
+      <w:r>
+        <w:rPr>
+          <w:sz w:val="48"/>
+          <w:szCs w:val="48"/>
+        </w:rPr>
+        <w:t>Bike Rental Prediction</w:t>
+      </w:r>
+      <w:r>
+        <w:rPr>
+          <w:sz w:val="48"/>
+          <w:szCs w:val="48"/>
+        </w:rPr>
+        <w:t>)</w:t>
+      </w:r>
+    </w:p>
+    <w:p>
+      <w:pPr>
+        <w:pStyle w:val="Title"/>
+        <w:rPr>
+          <w:sz w:val="48"/>
+          <w:szCs w:val="48"/>
+        </w:rPr>
+      </w:pPr>
+      <w:r>
+        <w:rPr>
+          <w:sz w:val="48"/>
+          <w:szCs w:val="48"/>
+        </w:rPr>
+        <w:t>Domain Understanding &amp; Explainable AI</w:t>
       </w:r>
     </w:p>
     <w:p/>
+    <w:sdt>
+      <w:sdtPr>
+        <w:rPr>
+          <w:rFonts w:asciiTheme="minorHAnsi" w:eastAsiaTheme="minorHAnsi" w:hAnsiTheme="minorHAnsi" w:cstheme="minorBidi"/>
+          <w:noProof/>
+          <w:color w:val="auto"/>
+          <w:sz w:val="24"/>
+          <w:szCs w:val="24"/>
+          <w:lang w:val="en-GB"/>
+          <w14:ligatures w14:val="standardContextual"/>
+        </w:rPr>
+        <w:id w:val="-571427833"/>
+        <w:docPartObj>
+          <w:docPartGallery w:val="Table of Contents"/>
+          <w:docPartUnique/>
+        </w:docPartObj>
+      </w:sdtPr>
+      <w:sdtEndPr>
+        <w:rPr>
+          <w:b/>
+          <w:bCs/>
+        </w:rPr>
+      </w:sdtEndPr>
+      <w:sdtContent>
+        <w:p>
+          <w:pPr>
+            <w:pStyle w:val="TOCHeading"/>
+          </w:pPr>
+          <w:r>
+            <w:t>Table of Contents</w:t>
+          </w:r>
+        </w:p>
+        <w:p>
+          <w:pPr>
+            <w:pStyle w:val="TOC2"/>
+            <w:tabs>
+              <w:tab w:val="right" w:leader="dot" w:pos="9016"/>
+            </w:tabs>
+            <w:rPr>
+              <w:rFonts w:eastAsiaTheme="minorEastAsia"/>
+              <w:kern w:val="2"/>
+              <w:lang w:eastAsia="en-GB"/>
+            </w:rPr>
+          </w:pPr>
+          <w:r>
+            <w:fldChar w:fldCharType="begin"/>
+          </w:r>
+          <w:r>
+            <w:instrText xml:space="preserve"> TOC \o "1-3" \h \z \u </w:instrText>
+          </w:r>
+          <w:r>
+            <w:fldChar w:fldCharType="separate"/>
+          </w:r>
+          <w:hyperlink w:anchor="_Toc212585485" w:history="1">
+            <w:r>
+              <w:rPr>
+                <w:rStyle w:val="Hyperlink"/>
+              </w:rPr>
+              <w:t>1. Introduction</w:t>
+            </w:r>
+            <w:r>
+              <w:rPr>
+                <w:webHidden/>
+              </w:rPr>
+              <w:tab/>
+            </w:r>
+            <w:r>
+              <w:rPr>
+                <w:webHidden/>
+              </w:rPr>
+              <w:fldChar w:fldCharType="begin"/>
+            </w:r>
+            <w:r>
+              <w:rPr>
+                <w:webHidden/>
+              </w:rPr>
+              <w:instrText xml:space="preserve"> PAGEREF _Toc212585485 \h </w:instrText>
+            </w:r>
+            <w:r>
+              <w:rPr>
+                <w:webHidden/>
+              </w:rPr>
+            </w:r>
+            <w:r>
+              <w:rPr>
+                <w:webHidden/>
+              </w:rPr>
+              <w:fldChar w:fldCharType="separate"/>
+            </w:r>
+            <w:r>
+              <w:rPr>
+                <w:webHidden/>
+              </w:rPr>
+              <w:t>2</w:t>
+            </w:r>
+            <w:r>
+              <w:rPr>
+                <w:webHidden/>
+              </w:rPr>
+              <w:fldChar w:fldCharType="end"/>
+            </w:r>
+          </w:hyperlink>
+        </w:p>
+        <w:p>
+          <w:pPr>
+            <w:pStyle w:val="TOC3"/>
+            <w:tabs>
+              <w:tab w:val="right" w:leader="dot" w:pos="9016"/>
+            </w:tabs>
+            <w:rPr>
+              <w:rFonts w:eastAsiaTheme="minorEastAsia"/>
+              <w:kern w:val="2"/>
+              <w:lang w:eastAsia="en-GB"/>
+            </w:rPr>
+          </w:pPr>
+          <w:hyperlink w:anchor="_Toc212585486" w:history="1">
+            <w:r>
+              <w:rPr>
+                <w:rStyle w:val="Hyperlink"/>
+              </w:rPr>
+              <w:t>1.1 Project Scope and Dutch Context</w:t>
+            </w:r>
+            <w:r>
+              <w:rPr>
+                <w:webHidden/>
+              </w:rPr>
+              <w:tab/>
+            </w:r>
+            <w:r>
+              <w:rPr>
+                <w:webHidden/>
+              </w:rPr>
+              <w:fldChar w:fldCharType="begin"/>
+            </w:r>
+            <w:r>
+              <w:rPr>
+                <w:webHidden/>
+              </w:rPr>
+              <w:instrText xml:space="preserve"> PAGEREF _Toc212585486 \h </w:instrText>
+            </w:r>
+            <w:r>
+              <w:rPr>
+                <w:webHidden/>
+              </w:rPr>
+            </w:r>
+            <w:r>
+              <w:rPr>
+                <w:webHidden/>
+              </w:rPr>
+              <w:fldChar w:fldCharType="separate"/>
+            </w:r>
+            <w:r>
+              <w:rPr>
+                <w:webHidden/>
+              </w:rPr>
+              <w:t>2</w:t>
+            </w:r>
+            <w:r>
+              <w:rPr>
+                <w:webHidden/>
+              </w:rPr>
+              <w:fldChar w:fldCharType="end"/>
+            </w:r>
+          </w:hyperlink>
+        </w:p>
+        <w:p>
+          <w:pPr>
+            <w:pStyle w:val="TOC3"/>
+            <w:tabs>
+              <w:tab w:val="right" w:leader="dot" w:pos="9016"/>
+            </w:tabs>
+            <w:rPr>
+              <w:rFonts w:eastAsiaTheme="minorEastAsia"/>
+              <w:kern w:val="2"/>
+              <w:lang w:eastAsia="en-GB"/>
+            </w:rPr>
+          </w:pPr>
+          <w:hyperlink w:anchor="_Toc212585487" w:history="1">
+            <w:r>
+              <w:rPr>
+                <w:rStyle w:val="Hyperlink"/>
+              </w:rPr>
+              <w:t>1.2 Motivation and Practical Value of Daily Forecasting</w:t>
+            </w:r>
+            <w:r>
+              <w:rPr>
+                <w:webHidden/>
+              </w:rPr>
+              <w:tab/>
+            </w:r>
+            <w:r>
+              <w:rPr>
+                <w:webHidden/>
+              </w:rPr>
+              <w:fldChar w:fldCharType="begin"/>
+            </w:r>
+            <w:r>
+              <w:rPr>
+                <w:webHidden/>
+              </w:rPr>
+              <w:instrText xml:space="preserve"> PAGEREF _Toc212585487 \h </w:instrText>
+            </w:r>
+            <w:r>
+              <w:rPr>
+                <w:webHidden/>
+              </w:rPr>
+            </w:r>
+            <w:r>
+              <w:rPr>
+                <w:webHidden/>
+              </w:rPr>
+              <w:fldChar w:fldCharType="separate"/>
+            </w:r>
+            <w:r>
+              <w:rPr>
+                <w:webHidden/>
+              </w:rPr>
+              <w:t>2</w:t>
+            </w:r>
+            <w:r>
+              <w:rPr>
+                <w:webHidden/>
+              </w:rPr>
+              <w:fldChar w:fldCharType="end"/>
+            </w:r>
+          </w:hyperlink>
+        </w:p>
+        <w:p>
+          <w:pPr>
+            <w:pStyle w:val="TOC3"/>
+            <w:tabs>
+              <w:tab w:val="right" w:leader="dot" w:pos="9016"/>
+            </w:tabs>
+            <w:rPr>
+              <w:rFonts w:eastAsiaTheme="minorEastAsia"/>
+              <w:kern w:val="2"/>
+              <w:lang w:eastAsia="en-GB"/>
+            </w:rPr>
+          </w:pPr>
+          <w:hyperlink w:anchor="_Toc212585488" w:history="1">
+            <w:r>
+              <w:rPr>
+                <w:rStyle w:val="Hyperlink"/>
+              </w:rPr>
+              <w:t>1.3 Document Purpose and Scope</w:t>
+            </w:r>
+            <w:r>
+              <w:rPr>
+                <w:webHidden/>
+              </w:rPr>
+              <w:tab/>
+            </w:r>
+            <w:r>
+              <w:rPr>
+                <w:webHidden/>
+              </w:rPr>
+              <w:fldChar w:fldCharType="begin"/>
+            </w:r>
+            <w:r>
+              <w:rPr>
+                <w:webHidden/>
+              </w:rPr>
+              <w:instrText xml:space="preserve"> PAGEREF _Toc212585488 \h </w:instrText>
+            </w:r>
+            <w:r>
+              <w:rPr>
+                <w:webHidden/>
+              </w:rPr>
+            </w:r>
+            <w:r>
+              <w:rPr>
+                <w:webHidden/>
+              </w:rPr>
+              <w:fldChar w:fldCharType="separate"/>
+            </w:r>
+            <w:r>
+              <w:rPr>
+                <w:webHidden/>
+              </w:rPr>
+              <w:t>2</w:t>
+            </w:r>
+            <w:r>
+              <w:rPr>
+                <w:webHidden/>
+              </w:rPr>
+              <w:fldChar w:fldCharType="end"/>
+            </w:r>
+          </w:hyperlink>
+        </w:p>
+        <w:p>
+          <w:pPr>
+            <w:pStyle w:val="TOC2"/>
+            <w:tabs>
+              <w:tab w:val="right" w:leader="dot" w:pos="9016"/>
+            </w:tabs>
+            <w:rPr>
+              <w:rFonts w:eastAsiaTheme="minorEastAsia"/>
+              <w:kern w:val="2"/>
+              <w:lang w:eastAsia="en-GB"/>
+            </w:rPr>
+          </w:pPr>
+          <w:hyperlink w:anchor="_Toc212585489" w:history="1">
+            <w:r>
+              <w:rPr>
+                <w:rStyle w:val="Hyperlink"/>
+              </w:rPr>
+              <w:t>2. Explainable AI, What and Why</w:t>
+            </w:r>
+            <w:r>
+              <w:rPr>
+                <w:webHidden/>
+              </w:rPr>
+              <w:tab/>
+            </w:r>
+            <w:r>
+              <w:rPr>
+                <w:webHidden/>
+              </w:rPr>
+              <w:fldChar w:fldCharType="begin"/>
+            </w:r>
+            <w:r>
+              <w:rPr>
+                <w:webHidden/>
+              </w:rPr>
+              <w:instrText xml:space="preserve"> PAGEREF _Toc212585489 \h </w:instrText>
+            </w:r>
+            <w:r>
+              <w:rPr>
+                <w:webHidden/>
+              </w:rPr>
+            </w:r>
+            <w:r>
+              <w:rPr>
+                <w:webHidden/>
+              </w:rPr>
+              <w:fldChar w:fldCharType="separate"/>
+            </w:r>
+            <w:r>
+              <w:rPr>
+                <w:webHidden/>
+              </w:rPr>
+              <w:t>2</w:t>
+            </w:r>
+            <w:r>
+              <w:rPr>
+                <w:webHidden/>
+              </w:rPr>
+              <w:fldChar w:fldCharType="end"/>
+            </w:r>
+          </w:hyperlink>
+        </w:p>
+        <w:p>
+          <w:pPr>
+            <w:pStyle w:val="TOC3"/>
+            <w:tabs>
+              <w:tab w:val="right" w:leader="dot" w:pos="9016"/>
+            </w:tabs>
+            <w:rPr>
+              <w:rFonts w:eastAsiaTheme="minorEastAsia"/>
+              <w:kern w:val="2"/>
+              <w:lang w:eastAsia="en-GB"/>
+            </w:rPr>
+          </w:pPr>
+          <w:hyperlink w:anchor="_Toc212585490" w:history="1">
+            <w:r>
+              <w:rPr>
+                <w:rStyle w:val="Hyperlink"/>
+              </w:rPr>
+              <w:t>2.1 Core Definitions and Key Concepts</w:t>
+            </w:r>
+            <w:r>
+              <w:rPr>
+                <w:webHidden/>
+              </w:rPr>
+              <w:tab/>
+            </w:r>
+            <w:r>
+              <w:rPr>
+                <w:webHidden/>
+              </w:rPr>
+              <w:fldChar w:fldCharType="begin"/>
+            </w:r>
+            <w:r>
+              <w:rPr>
+                <w:webHidden/>
+              </w:rPr>
+              <w:instrText xml:space="preserve"> PAGEREF _Toc212585490 \h </w:instrText>
+            </w:r>
+            <w:r>
+              <w:rPr>
+                <w:webHidden/>
+              </w:rPr>
+            </w:r>
+            <w:r>
+              <w:rPr>
+                <w:webHidden/>
+              </w:rPr>
+              <w:fldChar w:fldCharType="separate"/>
+            </w:r>
+            <w:r>
+              <w:rPr>
+                <w:webHidden/>
+              </w:rPr>
+              <w:t>2</w:t>
+            </w:r>
+            <w:r>
+              <w:rPr>
+                <w:webHidden/>
+              </w:rPr>
+              <w:fldChar w:fldCharType="end"/>
+            </w:r>
+          </w:hyperlink>
+        </w:p>
+        <w:p>
+          <w:pPr>
+            <w:pStyle w:val="TOC3"/>
+            <w:tabs>
+              <w:tab w:val="right" w:leader="dot" w:pos="9016"/>
+            </w:tabs>
+            <w:rPr>
+              <w:rFonts w:eastAsiaTheme="minorEastAsia"/>
+              <w:kern w:val="2"/>
+              <w:lang w:eastAsia="en-GB"/>
+            </w:rPr>
+          </w:pPr>
+          <w:hyperlink w:anchor="_Toc212585491" w:history="1">
+            <w:r>
+              <w:rPr>
+                <w:rStyle w:val="Hyperlink"/>
+              </w:rPr>
+              <w:t xml:space="preserve">2.2 </w:t>
+            </w:r>
+            <w:r>
+              <w:rPr>
+                <w:rStyle w:val="Hyperlink"/>
+                <w:i/>
+                <w:iCs/>
+              </w:rPr>
+              <w:t>Importance of Explainability in Public Mobility</w:t>
+            </w:r>
+            <w:r>
+              <w:rPr>
+                <w:webHidden/>
+              </w:rPr>
+              <w:tab/>
+            </w:r>
+            <w:r>
+              <w:rPr>
+                <w:webHidden/>
+              </w:rPr>
+              <w:fldChar w:fldCharType="begin"/>
+            </w:r>
+            <w:r>
+              <w:rPr>
+                <w:webHidden/>
+              </w:rPr>
+              <w:instrText xml:space="preserve"> PAGEREF _Toc212585491 \h </w:instrText>
+            </w:r>
+            <w:r>
+              <w:rPr>
+                <w:webHidden/>
+              </w:rPr>
+            </w:r>
+            <w:r>
+              <w:rPr>
+                <w:webHidden/>
+              </w:rPr>
+              <w:fldChar w:fldCharType="separate"/>
+            </w:r>
+            <w:r>
+              <w:rPr>
+                <w:webHidden/>
+              </w:rPr>
+              <w:t>3</w:t>
+            </w:r>
+            <w:r>
+              <w:rPr>
+                <w:webHidden/>
+              </w:rPr>
+              <w:fldChar w:fldCharType="end"/>
+            </w:r>
+          </w:hyperlink>
+        </w:p>
+        <w:p>
+          <w:pPr>
+            <w:pStyle w:val="TOC3"/>
+            <w:tabs>
+              <w:tab w:val="right" w:leader="dot" w:pos="9016"/>
+            </w:tabs>
+            <w:rPr>
+              <w:rFonts w:eastAsiaTheme="minorEastAsia"/>
+              <w:kern w:val="2"/>
+              <w:lang w:eastAsia="en-GB"/>
+            </w:rPr>
+          </w:pPr>
+          <w:hyperlink w:anchor="_Toc212585492" w:history="1">
+            <w:r>
+              <w:rPr>
+                <w:rStyle w:val="Hyperlink"/>
+              </w:rPr>
+              <w:t>2.3 Core Principles of Explainable AI</w:t>
+            </w:r>
+            <w:r>
+              <w:rPr>
+                <w:webHidden/>
+              </w:rPr>
+              <w:tab/>
+            </w:r>
+            <w:r>
+              <w:rPr>
+                <w:webHidden/>
+              </w:rPr>
+              <w:fldChar w:fldCharType="begin"/>
+            </w:r>
+            <w:r>
+              <w:rPr>
+                <w:webHidden/>
+              </w:rPr>
+              <w:instrText xml:space="preserve"> PAGEREF _Toc212585492 \h </w:instrText>
+            </w:r>
+            <w:r>
+              <w:rPr>
+                <w:webHidden/>
+              </w:rPr>
+            </w:r>
+            <w:r>
+              <w:rPr>
+                <w:webHidden/>
+              </w:rPr>
+              <w:fldChar w:fldCharType="separate"/>
+            </w:r>
+            <w:r>
+              <w:rPr>
+                <w:webHidden/>
+              </w:rPr>
+              <w:t>3</w:t>
+            </w:r>
+            <w:r>
+              <w:rPr>
+                <w:webHidden/>
+              </w:rPr>
+              <w:fldChar w:fldCharType="end"/>
+            </w:r>
+          </w:hyperlink>
+        </w:p>
+        <w:p>
+          <w:pPr>
+            <w:pStyle w:val="TOC2"/>
+            <w:tabs>
+              <w:tab w:val="right" w:leader="dot" w:pos="9016"/>
+            </w:tabs>
+            <w:rPr>
+              <w:rFonts w:eastAsiaTheme="minorEastAsia"/>
+              <w:kern w:val="2"/>
+              <w:lang w:eastAsia="en-GB"/>
+            </w:rPr>
+          </w:pPr>
+          <w:hyperlink w:anchor="_Toc212585493" w:history="1">
+            <w:r>
+              <w:rPr>
+                <w:rStyle w:val="Hyperlink"/>
+              </w:rPr>
+              <w:t>3. Domain Analysis</w:t>
+            </w:r>
+            <w:r>
+              <w:rPr>
+                <w:webHidden/>
+              </w:rPr>
+              <w:tab/>
+            </w:r>
+            <w:r>
+              <w:rPr>
+                <w:webHidden/>
+              </w:rPr>
+              <w:fldChar w:fldCharType="begin"/>
+            </w:r>
+            <w:r>
+              <w:rPr>
+                <w:webHidden/>
+              </w:rPr>
+              <w:instrText xml:space="preserve"> PAGEREF _Toc212585493 \h </w:instrText>
+            </w:r>
+            <w:r>
+              <w:rPr>
+                <w:webHidden/>
+              </w:rPr>
+            </w:r>
+            <w:r>
+              <w:rPr>
+                <w:webHidden/>
+              </w:rPr>
+              <w:fldChar w:fldCharType="separate"/>
+            </w:r>
+            <w:r>
+              <w:rPr>
+                <w:webHidden/>
+              </w:rPr>
+              <w:t>3</w:t>
+            </w:r>
+            <w:r>
+              <w:rPr>
+                <w:webHidden/>
+              </w:rPr>
+              <w:fldChar w:fldCharType="end"/>
+            </w:r>
+          </w:hyperlink>
+        </w:p>
+        <w:p>
+          <w:pPr>
+            <w:pStyle w:val="TOC3"/>
+            <w:tabs>
+              <w:tab w:val="right" w:leader="dot" w:pos="9016"/>
+            </w:tabs>
+            <w:rPr>
+              <w:rFonts w:eastAsiaTheme="minorEastAsia"/>
+              <w:kern w:val="2"/>
+              <w:lang w:eastAsia="en-GB"/>
+            </w:rPr>
+          </w:pPr>
+          <w:hyperlink w:anchor="_Toc212585494" w:history="1">
+            <w:r>
+              <w:rPr>
+                <w:rStyle w:val="Hyperlink"/>
+              </w:rPr>
+              <w:t>3.1 Research Question</w:t>
+            </w:r>
+            <w:r>
+              <w:rPr>
+                <w:webHidden/>
+              </w:rPr>
+              <w:tab/>
+            </w:r>
+            <w:r>
+              <w:rPr>
+                <w:webHidden/>
+              </w:rPr>
+              <w:fldChar w:fldCharType="begin"/>
+            </w:r>
+            <w:r>
+              <w:rPr>
+                <w:webHidden/>
+              </w:rPr>
+              <w:instrText xml:space="preserve"> PAGEREF _Toc212585494 \h </w:instrText>
+            </w:r>
+            <w:r>
+              <w:rPr>
+                <w:webHidden/>
+              </w:rPr>
+            </w:r>
+            <w:r>
+              <w:rPr>
+                <w:webHidden/>
+              </w:rPr>
+              <w:fldChar w:fldCharType="separate"/>
+            </w:r>
+            <w:r>
+              <w:rPr>
+                <w:webHidden/>
+              </w:rPr>
+              <w:t>3</w:t>
+            </w:r>
+            <w:r>
+              <w:rPr>
+                <w:webHidden/>
+              </w:rPr>
+              <w:fldChar w:fldCharType="end"/>
+            </w:r>
+          </w:hyperlink>
+        </w:p>
+        <w:p>
+          <w:pPr>
+            <w:pStyle w:val="TOC3"/>
+            <w:tabs>
+              <w:tab w:val="right" w:leader="dot" w:pos="9016"/>
+            </w:tabs>
+            <w:rPr>
+              <w:rFonts w:eastAsiaTheme="minorEastAsia"/>
+              <w:kern w:val="2"/>
+              <w:lang w:eastAsia="en-GB"/>
+            </w:rPr>
+          </w:pPr>
+          <w:hyperlink w:anchor="_Toc212585495" w:history="1">
+            <w:r>
+              <w:rPr>
+                <w:rStyle w:val="Hyperlink"/>
+              </w:rPr>
+              <w:t>3.2 Planned Analysis Activities</w:t>
+            </w:r>
+            <w:r>
+              <w:rPr>
+                <w:webHidden/>
+              </w:rPr>
+              <w:tab/>
+            </w:r>
+            <w:r>
+              <w:rPr>
+                <w:webHidden/>
+              </w:rPr>
+              <w:fldChar w:fldCharType="begin"/>
+            </w:r>
+            <w:r>
+              <w:rPr>
+                <w:webHidden/>
+              </w:rPr>
+              <w:instrText xml:space="preserve"> PAGEREF _Toc212585495 \h </w:instrText>
+            </w:r>
+            <w:r>
+              <w:rPr>
+                <w:webHidden/>
+              </w:rPr>
+            </w:r>
+            <w:r>
+              <w:rPr>
+                <w:webHidden/>
+              </w:rPr>
+              <w:fldChar w:fldCharType="separate"/>
+            </w:r>
+            <w:r>
+              <w:rPr>
+                <w:webHidden/>
+              </w:rPr>
+              <w:t>3</w:t>
+            </w:r>
+            <w:r>
+              <w:rPr>
+                <w:webHidden/>
+              </w:rPr>
+              <w:fldChar w:fldCharType="end"/>
+            </w:r>
+          </w:hyperlink>
+        </w:p>
+        <w:p>
+          <w:pPr>
+            <w:pStyle w:val="TOC3"/>
+            <w:tabs>
+              <w:tab w:val="right" w:leader="dot" w:pos="9016"/>
+            </w:tabs>
+            <w:rPr>
+              <w:rFonts w:eastAsiaTheme="minorEastAsia"/>
+              <w:kern w:val="2"/>
+              <w:lang w:eastAsia="en-GB"/>
+            </w:rPr>
+          </w:pPr>
+          <w:hyperlink w:anchor="_Toc212585496" w:history="1">
+            <w:r>
+              <w:rPr>
+                <w:rStyle w:val="Hyperlink"/>
+              </w:rPr>
+              <w:t>3.3 Problem Statement and Rationale</w:t>
+            </w:r>
+            <w:r>
+              <w:rPr>
+                <w:webHidden/>
+              </w:rPr>
+              <w:tab/>
+            </w:r>
+            <w:r>
+              <w:rPr>
+                <w:webHidden/>
+              </w:rPr>
+              <w:fldChar w:fldCharType="begin"/>
+            </w:r>
+            <w:r>
+              <w:rPr>
+                <w:webHidden/>
+              </w:rPr>
+              <w:instrText xml:space="preserve"> PAGEREF _Toc212585496 \h </w:instrText>
+            </w:r>
+            <w:r>
+              <w:rPr>
+                <w:webHidden/>
+              </w:rPr>
+            </w:r>
+            <w:r>
+              <w:rPr>
+                <w:webHidden/>
+              </w:rPr>
+              <w:fldChar w:fldCharType="separate"/>
+            </w:r>
+            <w:r>
+              <w:rPr>
+                <w:webHidden/>
+              </w:rPr>
+              <w:t>3</w:t>
+            </w:r>
+            <w:r>
+              <w:rPr>
+                <w:webHidden/>
+              </w:rPr>
+              <w:fldChar w:fldCharType="end"/>
+            </w:r>
+          </w:hyperlink>
+        </w:p>
+        <w:p>
+          <w:pPr>
+            <w:pStyle w:val="TOC3"/>
+            <w:tabs>
+              <w:tab w:val="right" w:leader="dot" w:pos="9016"/>
+            </w:tabs>
+            <w:rPr>
+              <w:rFonts w:eastAsiaTheme="minorEastAsia"/>
+              <w:kern w:val="2"/>
+              <w:lang w:eastAsia="en-GB"/>
+            </w:rPr>
+          </w:pPr>
+          <w:hyperlink w:anchor="_Toc212585497" w:history="1">
+            <w:r>
+              <w:rPr>
+                <w:rStyle w:val="Hyperlink"/>
+              </w:rPr>
+              <w:t>3.4 Observed Factors Influencing Daily Rental Demand</w:t>
+            </w:r>
+            <w:r>
+              <w:rPr>
+                <w:webHidden/>
+              </w:rPr>
+              <w:tab/>
+            </w:r>
+            <w:r>
+              <w:rPr>
+                <w:webHidden/>
+              </w:rPr>
+              <w:fldChar w:fldCharType="begin"/>
+            </w:r>
+            <w:r>
+              <w:rPr>
+                <w:webHidden/>
+              </w:rPr>
+              <w:instrText xml:space="preserve"> PAGEREF _Toc212585497 \h </w:instrText>
+            </w:r>
+            <w:r>
+              <w:rPr>
+                <w:webHidden/>
+              </w:rPr>
+            </w:r>
+            <w:r>
+              <w:rPr>
+                <w:webHidden/>
+              </w:rPr>
+              <w:fldChar w:fldCharType="separate"/>
+            </w:r>
+            <w:r>
+              <w:rPr>
+                <w:webHidden/>
+              </w:rPr>
+              <w:t>4</w:t>
+            </w:r>
+            <w:r>
+              <w:rPr>
+                <w:webHidden/>
+              </w:rPr>
+              <w:fldChar w:fldCharType="end"/>
+            </w:r>
+          </w:hyperlink>
+        </w:p>
+        <w:p>
+          <w:pPr>
+            <w:pStyle w:val="TOC3"/>
+            <w:tabs>
+              <w:tab w:val="right" w:leader="dot" w:pos="9016"/>
+            </w:tabs>
+            <w:rPr>
+              <w:rFonts w:eastAsiaTheme="minorEastAsia"/>
+              <w:kern w:val="2"/>
+              <w:lang w:eastAsia="en-GB"/>
+            </w:rPr>
+          </w:pPr>
+          <w:hyperlink w:anchor="_Toc212585498" w:history="1">
+            <w:r>
+              <w:rPr>
+                <w:rStyle w:val="Hyperlink"/>
+              </w:rPr>
+              <w:t>3.5 Summary of Domain Insights</w:t>
+            </w:r>
+            <w:r>
+              <w:rPr>
+                <w:webHidden/>
+              </w:rPr>
+              <w:tab/>
+            </w:r>
+            <w:r>
+              <w:rPr>
+                <w:webHidden/>
+              </w:rPr>
+              <w:fldChar w:fldCharType="begin"/>
+            </w:r>
+            <w:r>
+              <w:rPr>
+                <w:webHidden/>
+              </w:rPr>
+              <w:instrText xml:space="preserve"> PAGEREF _Toc212585498 \h </w:instrText>
+            </w:r>
+            <w:r>
+              <w:rPr>
+                <w:webHidden/>
+              </w:rPr>
+            </w:r>
+            <w:r>
+              <w:rPr>
+                <w:webHidden/>
+              </w:rPr>
+              <w:fldChar w:fldCharType="separate"/>
+            </w:r>
+            <w:r>
+              <w:rPr>
+                <w:webHidden/>
+              </w:rPr>
+              <w:t>4</w:t>
+            </w:r>
+            <w:r>
+              <w:rPr>
+                <w:webHidden/>
+              </w:rPr>
+              <w:fldChar w:fldCharType="end"/>
+            </w:r>
+          </w:hyperlink>
+        </w:p>
+        <w:p>
+          <w:pPr>
+            <w:pStyle w:val="TOC2"/>
+            <w:tabs>
+              <w:tab w:val="right" w:leader="dot" w:pos="9016"/>
+            </w:tabs>
+            <w:rPr>
+              <w:rFonts w:eastAsiaTheme="minorEastAsia"/>
+              <w:kern w:val="2"/>
+              <w:lang w:eastAsia="en-GB"/>
+            </w:rPr>
+          </w:pPr>
+          <w:hyperlink w:anchor="_Toc212585499" w:history="1">
+            <w:r>
+              <w:rPr>
+                <w:rStyle w:val="Hyperlink"/>
+              </w:rPr>
+              <w:t>4. Explainable AI in This Project, Stakeholders and Use Cases</w:t>
+            </w:r>
+            <w:r>
+              <w:rPr>
+                <w:webHidden/>
+              </w:rPr>
+              <w:tab/>
+            </w:r>
+            <w:r>
+              <w:rPr>
+                <w:webHidden/>
+              </w:rPr>
+              <w:fldChar w:fldCharType="begin"/>
+            </w:r>
+            <w:r>
+              <w:rPr>
+                <w:webHidden/>
+              </w:rPr>
+              <w:instrText xml:space="preserve"> PAGEREF _Toc212585499 \h </w:instrText>
+            </w:r>
+            <w:r>
+              <w:rPr>
+                <w:webHidden/>
+              </w:rPr>
+            </w:r>
+            <w:r>
+              <w:rPr>
+                <w:webHidden/>
+              </w:rPr>
+              <w:fldChar w:fldCharType="separate"/>
+            </w:r>
+            <w:r>
+              <w:rPr>
+                <w:webHidden/>
+              </w:rPr>
+              <w:t>4</w:t>
+            </w:r>
+            <w:r>
+              <w:rPr>
+                <w:webHidden/>
+              </w:rPr>
+              <w:fldChar w:fldCharType="end"/>
+            </w:r>
+          </w:hyperlink>
+        </w:p>
+        <w:p>
+          <w:pPr>
+            <w:pStyle w:val="TOC3"/>
+            <w:tabs>
+              <w:tab w:val="right" w:leader="dot" w:pos="9016"/>
+            </w:tabs>
+            <w:rPr>
+              <w:rFonts w:eastAsiaTheme="minorEastAsia"/>
+              <w:kern w:val="2"/>
+              <w:lang w:eastAsia="en-GB"/>
+            </w:rPr>
+          </w:pPr>
+          <w:hyperlink w:anchor="_Toc212585500" w:history="1">
+            <w:r>
+              <w:rPr>
+                <w:rStyle w:val="Hyperlink"/>
+              </w:rPr>
+              <w:t>4.1 Operational Perspective (Company Use Case)</w:t>
+            </w:r>
+            <w:r>
+              <w:rPr>
+                <w:webHidden/>
+              </w:rPr>
+              <w:tab/>
+            </w:r>
+            <w:r>
+              <w:rPr>
+                <w:webHidden/>
+              </w:rPr>
+              <w:fldChar w:fldCharType="begin"/>
+            </w:r>
+            <w:r>
+              <w:rPr>
+                <w:webHidden/>
+              </w:rPr>
+              <w:instrText xml:space="preserve"> PAGEREF _Toc212585500 \h </w:instrText>
+            </w:r>
+            <w:r>
+              <w:rPr>
+                <w:webHidden/>
+              </w:rPr>
+            </w:r>
+            <w:r>
+              <w:rPr>
+                <w:webHidden/>
+              </w:rPr>
+              <w:fldChar w:fldCharType="separate"/>
+            </w:r>
+            <w:r>
+              <w:rPr>
+                <w:webHidden/>
+              </w:rPr>
+              <w:t>4</w:t>
+            </w:r>
+            <w:r>
+              <w:rPr>
+                <w:webHidden/>
+              </w:rPr>
+              <w:fldChar w:fldCharType="end"/>
+            </w:r>
+          </w:hyperlink>
+        </w:p>
+        <w:p>
+          <w:pPr>
+            <w:pStyle w:val="TOC3"/>
+            <w:tabs>
+              <w:tab w:val="right" w:leader="dot" w:pos="9016"/>
+            </w:tabs>
+            <w:rPr>
+              <w:rFonts w:eastAsiaTheme="minorEastAsia"/>
+              <w:kern w:val="2"/>
+              <w:lang w:eastAsia="en-GB"/>
+            </w:rPr>
+          </w:pPr>
+          <w:hyperlink w:anchor="_Toc212585501" w:history="1">
+            <w:r>
+              <w:rPr>
+                <w:rStyle w:val="Hyperlink"/>
+              </w:rPr>
+              <w:t>4.2 Customer Perspective (Rider Experience)</w:t>
+            </w:r>
+            <w:r>
+              <w:rPr>
+                <w:webHidden/>
+              </w:rPr>
+              <w:tab/>
+            </w:r>
+            <w:r>
+              <w:rPr>
+                <w:webHidden/>
+              </w:rPr>
+              <w:fldChar w:fldCharType="begin"/>
+            </w:r>
+            <w:r>
+              <w:rPr>
+                <w:webHidden/>
+              </w:rPr>
+              <w:instrText xml:space="preserve"> PAGEREF _Toc212585501 \h </w:instrText>
+            </w:r>
+            <w:r>
+              <w:rPr>
+                <w:webHidden/>
+              </w:rPr>
+            </w:r>
+            <w:r>
+              <w:rPr>
+                <w:webHidden/>
+              </w:rPr>
+              <w:fldChar w:fldCharType="separate"/>
+            </w:r>
+            <w:r>
+              <w:rPr>
+                <w:webHidden/>
+              </w:rPr>
+              <w:t>5</w:t>
+            </w:r>
+            <w:r>
+              <w:rPr>
+                <w:webHidden/>
+              </w:rPr>
+              <w:fldChar w:fldCharType="end"/>
+            </w:r>
+          </w:hyperlink>
+        </w:p>
+        <w:p>
+          <w:pPr>
+            <w:pStyle w:val="TOC3"/>
+            <w:tabs>
+              <w:tab w:val="right" w:leader="dot" w:pos="9016"/>
+            </w:tabs>
+            <w:rPr>
+              <w:rFonts w:eastAsiaTheme="minorEastAsia"/>
+              <w:kern w:val="2"/>
+              <w:lang w:eastAsia="en-GB"/>
+            </w:rPr>
+          </w:pPr>
+          <w:hyperlink w:anchor="_Toc212585502" w:history="1">
+            <w:r>
+              <w:rPr>
+                <w:rStyle w:val="Hyperlink"/>
+              </w:rPr>
+              <w:t>4.3 Trustworthy and transparent AI applied to decisions in this context</w:t>
+            </w:r>
+            <w:r>
+              <w:rPr>
+                <w:webHidden/>
+              </w:rPr>
+              <w:tab/>
+            </w:r>
+            <w:r>
+              <w:rPr>
+                <w:webHidden/>
+              </w:rPr>
+              <w:fldChar w:fldCharType="begin"/>
+            </w:r>
+            <w:r>
+              <w:rPr>
+                <w:webHidden/>
+              </w:rPr>
+              <w:instrText xml:space="preserve"> PAGEREF _Toc212585502 \h </w:instrText>
+            </w:r>
+            <w:r>
+              <w:rPr>
+                <w:webHidden/>
+              </w:rPr>
+            </w:r>
+            <w:r>
+              <w:rPr>
+                <w:webHidden/>
+              </w:rPr>
+              <w:fldChar w:fldCharType="separate"/>
+            </w:r>
+            <w:r>
+              <w:rPr>
+                <w:webHidden/>
+              </w:rPr>
+              <w:t>5</w:t>
+            </w:r>
+            <w:r>
+              <w:rPr>
+                <w:webHidden/>
+              </w:rPr>
+              <w:fldChar w:fldCharType="end"/>
+            </w:r>
+          </w:hyperlink>
+        </w:p>
+        <w:p>
+          <w:pPr>
+            <w:pStyle w:val="TOC2"/>
+            <w:tabs>
+              <w:tab w:val="right" w:leader="dot" w:pos="9016"/>
+            </w:tabs>
+            <w:rPr>
+              <w:rFonts w:eastAsiaTheme="minorEastAsia"/>
+              <w:kern w:val="2"/>
+              <w:lang w:eastAsia="en-GB"/>
+            </w:rPr>
+          </w:pPr>
+          <w:hyperlink w:anchor="_Toc212585503" w:history="1">
+            <w:r>
+              <w:rPr>
+                <w:rStyle w:val="Hyperlink"/>
+              </w:rPr>
+              <w:t>5. Data Requirements Based On Domain</w:t>
+            </w:r>
+            <w:r>
+              <w:rPr>
+                <w:webHidden/>
+              </w:rPr>
+              <w:tab/>
+            </w:r>
+            <w:r>
+              <w:rPr>
+                <w:webHidden/>
+              </w:rPr>
+              <w:fldChar w:fldCharType="begin"/>
+            </w:r>
+            <w:r>
+              <w:rPr>
+                <w:webHidden/>
+              </w:rPr>
+              <w:instrText xml:space="preserve"> PAGEREF _Toc212585503 \h </w:instrText>
+            </w:r>
+            <w:r>
+              <w:rPr>
+                <w:webHidden/>
+              </w:rPr>
+            </w:r>
+            <w:r>
+              <w:rPr>
+                <w:webHidden/>
+              </w:rPr>
+              <w:fldChar w:fldCharType="separate"/>
+            </w:r>
+            <w:r>
+              <w:rPr>
+                <w:webHidden/>
+              </w:rPr>
+              <w:t>5</w:t>
+            </w:r>
+            <w:r>
+              <w:rPr>
+                <w:webHidden/>
+              </w:rPr>
+              <w:fldChar w:fldCharType="end"/>
+            </w:r>
+          </w:hyperlink>
+        </w:p>
+        <w:p>
+          <w:pPr>
+            <w:pStyle w:val="TOC3"/>
+            <w:tabs>
+              <w:tab w:val="right" w:leader="dot" w:pos="9016"/>
+            </w:tabs>
+            <w:rPr>
+              <w:rFonts w:eastAsiaTheme="minorEastAsia"/>
+              <w:kern w:val="2"/>
+              <w:lang w:eastAsia="en-GB"/>
+            </w:rPr>
+          </w:pPr>
+          <w:hyperlink w:anchor="_Toc212585504" w:history="1">
+            <w:r>
+              <w:rPr>
+                <w:rStyle w:val="Hyperlink"/>
+              </w:rPr>
+              <w:t>5.1 Target Definition: Daily Total Rentals</w:t>
+            </w:r>
+            <w:r>
+              <w:rPr>
+                <w:webHidden/>
+              </w:rPr>
+              <w:tab/>
+            </w:r>
+            <w:r>
+              <w:rPr>
+                <w:webHidden/>
+              </w:rPr>
+              <w:fldChar w:fldCharType="begin"/>
+            </w:r>
+            <w:r>
+              <w:rPr>
+                <w:webHidden/>
+              </w:rPr>
+              <w:instrText xml:space="preserve"> PAGEREF _Toc212585504 \h </w:instrText>
+            </w:r>
+            <w:r>
+              <w:rPr>
+                <w:webHidden/>
+              </w:rPr>
+            </w:r>
+            <w:r>
+              <w:rPr>
+                <w:webHidden/>
+              </w:rPr>
+              <w:fldChar w:fldCharType="separate"/>
+            </w:r>
+            <w:r>
+              <w:rPr>
+                <w:webHidden/>
+              </w:rPr>
+              <w:t>5</w:t>
+            </w:r>
+            <w:r>
+              <w:rPr>
+                <w:webHidden/>
+              </w:rPr>
+              <w:fldChar w:fldCharType="end"/>
+            </w:r>
+          </w:hyperlink>
+        </w:p>
+        <w:p>
+          <w:pPr>
+            <w:pStyle w:val="TOC3"/>
+            <w:tabs>
+              <w:tab w:val="right" w:leader="dot" w:pos="9016"/>
+            </w:tabs>
+            <w:rPr>
+              <w:rFonts w:eastAsiaTheme="minorEastAsia"/>
+              <w:kern w:val="2"/>
+              <w:lang w:eastAsia="en-GB"/>
+            </w:rPr>
+          </w:pPr>
+          <w:hyperlink w:anchor="_Toc212585505" w:history="1">
+            <w:r>
+              <w:rPr>
+                <w:rStyle w:val="Hyperlink"/>
+              </w:rPr>
+              <w:t>5.2 Input Variables and Optional Operational Signals</w:t>
+            </w:r>
+            <w:r>
+              <w:rPr>
+                <w:webHidden/>
+              </w:rPr>
+              <w:tab/>
+            </w:r>
+            <w:r>
+              <w:rPr>
+                <w:webHidden/>
+              </w:rPr>
+              <w:fldChar w:fldCharType="begin"/>
+            </w:r>
+            <w:r>
+              <w:rPr>
+                <w:webHidden/>
+              </w:rPr>
+              <w:instrText xml:space="preserve"> PAGEREF _Toc212585505 \h </w:instrText>
+            </w:r>
+            <w:r>
+              <w:rPr>
+                <w:webHidden/>
+              </w:rPr>
+            </w:r>
+            <w:r>
+              <w:rPr>
+                <w:webHidden/>
+              </w:rPr>
+              <w:fldChar w:fldCharType="separate"/>
+            </w:r>
+            <w:r>
+              <w:rPr>
+                <w:webHidden/>
+              </w:rPr>
+              <w:t>5</w:t>
+            </w:r>
+            <w:r>
+              <w:rPr>
+                <w:webHidden/>
+              </w:rPr>
+              <w:fldChar w:fldCharType="end"/>
+            </w:r>
+          </w:hyperlink>
+        </w:p>
+        <w:p>
+          <w:pPr>
+            <w:pStyle w:val="TOC3"/>
+            <w:tabs>
+              <w:tab w:val="right" w:leader="dot" w:pos="9016"/>
+            </w:tabs>
+            <w:rPr>
+              <w:rFonts w:eastAsiaTheme="minorEastAsia"/>
+              <w:kern w:val="2"/>
+              <w:lang w:eastAsia="en-GB"/>
+            </w:rPr>
+          </w:pPr>
+          <w:hyperlink w:anchor="_Toc212585506" w:history="1">
+            <w:r>
+              <w:rPr>
+                <w:rStyle w:val="Hyperlink"/>
+              </w:rPr>
+              <w:t>5.3 Granularity and Time Span</w:t>
+            </w:r>
+            <w:r>
+              <w:rPr>
+                <w:webHidden/>
+              </w:rPr>
+              <w:tab/>
+            </w:r>
+            <w:r>
+              <w:rPr>
+                <w:webHidden/>
+              </w:rPr>
+              <w:fldChar w:fldCharType="begin"/>
+            </w:r>
+            <w:r>
+              <w:rPr>
+                <w:webHidden/>
+              </w:rPr>
+              <w:instrText xml:space="preserve"> PAGEREF _Toc212585506 \h </w:instrText>
+            </w:r>
+            <w:r>
+              <w:rPr>
+                <w:webHidden/>
+              </w:rPr>
+            </w:r>
+            <w:r>
+              <w:rPr>
+                <w:webHidden/>
+              </w:rPr>
+              <w:fldChar w:fldCharType="separate"/>
+            </w:r>
+            <w:r>
+              <w:rPr>
+                <w:webHidden/>
+              </w:rPr>
+              <w:t>5</w:t>
+            </w:r>
+            <w:r>
+              <w:rPr>
+                <w:webHidden/>
+              </w:rPr>
+              <w:fldChar w:fldCharType="end"/>
+            </w:r>
+          </w:hyperlink>
+        </w:p>
+        <w:p>
+          <w:pPr>
+            <w:pStyle w:val="TOC3"/>
+            <w:tabs>
+              <w:tab w:val="right" w:leader="dot" w:pos="9016"/>
+            </w:tabs>
+            <w:rPr>
+              <w:rFonts w:eastAsiaTheme="minorEastAsia"/>
+              <w:kern w:val="2"/>
+              <w:lang w:eastAsia="en-GB"/>
+            </w:rPr>
+          </w:pPr>
+          <w:hyperlink w:anchor="_Toc212585507" w:history="1">
+            <w:r>
+              <w:rPr>
+                <w:rStyle w:val="Hyperlink"/>
+              </w:rPr>
+              <w:t>5.4 Data Quality and Governance</w:t>
+            </w:r>
+            <w:r>
+              <w:rPr>
+                <w:webHidden/>
+              </w:rPr>
+              <w:tab/>
+            </w:r>
+            <w:r>
+              <w:rPr>
+                <w:webHidden/>
+              </w:rPr>
+              <w:fldChar w:fldCharType="begin"/>
+            </w:r>
+            <w:r>
+              <w:rPr>
+                <w:webHidden/>
+              </w:rPr>
+              <w:instrText xml:space="preserve"> PAGEREF _Toc212585507 \h </w:instrText>
+            </w:r>
+            <w:r>
+              <w:rPr>
+                <w:webHidden/>
+              </w:rPr>
+            </w:r>
+            <w:r>
+              <w:rPr>
+                <w:webHidden/>
+              </w:rPr>
+              <w:fldChar w:fldCharType="separate"/>
+            </w:r>
+            <w:r>
+              <w:rPr>
+                <w:webHidden/>
+              </w:rPr>
+              <w:t>6</w:t>
+            </w:r>
+            <w:r>
+              <w:rPr>
+                <w:webHidden/>
+              </w:rPr>
+              <w:fldChar w:fldCharType="end"/>
+            </w:r>
+          </w:hyperlink>
+        </w:p>
+        <w:p>
+          <w:pPr>
+            <w:pStyle w:val="TOC3"/>
+            <w:tabs>
+              <w:tab w:val="right" w:leader="dot" w:pos="9016"/>
+            </w:tabs>
+            <w:rPr>
+              <w:rFonts w:eastAsiaTheme="minorEastAsia"/>
+              <w:kern w:val="2"/>
+              <w:lang w:eastAsia="en-GB"/>
+            </w:rPr>
+          </w:pPr>
+          <w:hyperlink w:anchor="_Toc212585508" w:history="1">
+            <w:r>
+              <w:rPr>
+                <w:rStyle w:val="Hyperlink"/>
+              </w:rPr>
+              <w:t>5.5 Candidate Data Sources</w:t>
+            </w:r>
+            <w:r>
+              <w:rPr>
+                <w:webHidden/>
+              </w:rPr>
+              <w:tab/>
+            </w:r>
+            <w:r>
+              <w:rPr>
+                <w:webHidden/>
+              </w:rPr>
+              <w:fldChar w:fldCharType="begin"/>
+            </w:r>
+            <w:r>
+              <w:rPr>
+                <w:webHidden/>
+              </w:rPr>
+              <w:instrText xml:space="preserve"> PAGEREF _Toc212585508 \h </w:instrText>
+            </w:r>
+            <w:r>
+              <w:rPr>
+                <w:webHidden/>
+              </w:rPr>
+            </w:r>
+            <w:r>
+              <w:rPr>
+                <w:webHidden/>
+              </w:rPr>
+              <w:fldChar w:fldCharType="separate"/>
+            </w:r>
+            <w:r>
+              <w:rPr>
+                <w:webHidden/>
+              </w:rPr>
+              <w:t>6</w:t>
+            </w:r>
+            <w:r>
+              <w:rPr>
+                <w:webHidden/>
+              </w:rPr>
+              <w:fldChar w:fldCharType="end"/>
+            </w:r>
+          </w:hyperlink>
+        </w:p>
+        <w:p>
+          <w:pPr>
+            <w:pStyle w:val="TOC2"/>
+            <w:tabs>
+              <w:tab w:val="right" w:leader="dot" w:pos="9016"/>
+            </w:tabs>
+            <w:rPr>
+              <w:rFonts w:eastAsiaTheme="minorEastAsia"/>
+              <w:kern w:val="2"/>
+              <w:lang w:eastAsia="en-GB"/>
+            </w:rPr>
+          </w:pPr>
+          <w:hyperlink w:anchor="_Toc212585509" w:history="1">
+            <w:r>
+              <w:rPr>
+                <w:rStyle w:val="Hyperlink"/>
+              </w:rPr>
+              <w:t>6. Research Methodology: DOT Frameworky</w:t>
+            </w:r>
+            <w:r>
+              <w:rPr>
+                <w:webHidden/>
+              </w:rPr>
+              <w:tab/>
+            </w:r>
+            <w:r>
+              <w:rPr>
+                <w:webHidden/>
+              </w:rPr>
+              <w:fldChar w:fldCharType="begin"/>
+            </w:r>
+            <w:r>
+              <w:rPr>
+                <w:webHidden/>
+              </w:rPr>
+              <w:instrText xml:space="preserve"> PAGEREF _Toc212585509 \h </w:instrText>
+            </w:r>
+            <w:r>
+              <w:rPr>
+                <w:webHidden/>
+              </w:rPr>
+            </w:r>
+            <w:r>
+              <w:rPr>
+                <w:webHidden/>
+              </w:rPr>
+              <w:fldChar w:fldCharType="separate"/>
+            </w:r>
+            <w:r>
+              <w:rPr>
+                <w:webHidden/>
+              </w:rPr>
+              <w:t>6</w:t>
+            </w:r>
+            <w:r>
+              <w:rPr>
+                <w:webHidden/>
+              </w:rPr>
+              <w:fldChar w:fldCharType="end"/>
+            </w:r>
+          </w:hyperlink>
+        </w:p>
+        <w:p>
+          <w:pPr>
+            <w:pStyle w:val="TOC2"/>
+            <w:tabs>
+              <w:tab w:val="right" w:leader="dot" w:pos="9016"/>
+            </w:tabs>
+            <w:rPr>
+              <w:rFonts w:eastAsiaTheme="minorEastAsia"/>
+              <w:kern w:val="2"/>
+              <w:lang w:eastAsia="en-GB"/>
+            </w:rPr>
+          </w:pPr>
+          <w:hyperlink w:anchor="_Toc212585510" w:history="1">
+            <w:r>
+              <w:rPr>
+                <w:rStyle w:val="Hyperlink"/>
+              </w:rPr>
+              <w:t>7. References and Resources</w:t>
+            </w:r>
+            <w:r>
+              <w:rPr>
+                <w:webHidden/>
+              </w:rPr>
+              <w:tab/>
+            </w:r>
+            <w:r>
+              <w:rPr>
+                <w:webHidden/>
+              </w:rPr>
+              <w:fldChar w:fldCharType="begin"/>
+            </w:r>
+            <w:r>
+              <w:rPr>
+                <w:webHidden/>
+              </w:rPr>
+              <w:instrText xml:space="preserve"> PAGEREF _Toc212585510 \h </w:instrText>
+            </w:r>
+            <w:r>
+              <w:rPr>
+                <w:webHidden/>
+              </w:rPr>
+            </w:r>
+            <w:r>
+              <w:rPr>
+                <w:webHidden/>
+              </w:rPr>
+              <w:fldChar w:fldCharType="separate"/>
+            </w:r>
+            <w:r>
+              <w:rPr>
+                <w:webHidden/>
+              </w:rPr>
+              <w:t>6</w:t>
+            </w:r>
+            <w:r>
+              <w:rPr>
+                <w:webHidden/>
+              </w:rPr>
+              <w:fldChar w:fldCharType="end"/>
+            </w:r>
+          </w:hyperlink>
+        </w:p>
+        <w:p>
+          <w:r>
+            <w:rPr>
+              <w:b/>
+              <w:bCs/>
+            </w:rPr>
+            <w:lastRenderedPageBreak/>
+            <w:fldChar w:fldCharType="end"/>
+          </w:r>
+        </w:p>
+      </w:sdtContent>
+    </w:sdt>
+    <w:p/>
     <w:p>
       <w:pPr>
         <w:pStyle w:val="Heading2"/>
       </w:pPr>
+      <w:bookmarkStart w:id="0" w:name="_Toc212585485"/>
       <w:r>
         <w:t>1. Introduction</w:t>
       </w:r>
+      <w:bookmarkEnd w:id="0"/>
     </w:p>
     <w:p>
       <w:pPr>
         <w:pStyle w:val="Heading3"/>
       </w:pPr>
-      <w:r>
-        <w:t>1.1 Project scope and Netherlands context</w:t>
-      </w:r>
+      <w:bookmarkStart w:id="1" w:name="_Toc212585486"/>
+      <w:r>
+        <w:t xml:space="preserve">1.1 </w:t>
+      </w:r>
+      <w:r>
+        <w:t>Project Scope and Dutch Context</w:t>
+      </w:r>
+      <w:bookmarkEnd w:id="1"/>
     </w:p>
     <w:p>
       <w:r>
@@ -66,22 +1792,38 @@
       <w:pPr>
         <w:pStyle w:val="Heading3"/>
       </w:pPr>
-      <w:r>
-        <w:t>1.2 Motivation and value for daily forecasting</w:t>
-      </w:r>
+      <w:bookmarkStart w:id="2" w:name="_Toc212585487"/>
+      <w:r>
+        <w:t xml:space="preserve">1.2 </w:t>
+      </w:r>
+      <w:r>
+        <w:t>Motivation and Practical Value of Daily Forecasting</w:t>
+      </w:r>
+      <w:bookmarkEnd w:id="2"/>
     </w:p>
     <w:p>
       <w:r>
-        <w:t xml:space="preserve">Daily forecasts help operators plan redistribution and maintenance on the right days, for example reducing unnecessary relocations on low-demand weather days, and improving availability when warm and dry conditions are expected. In cities where cycling is integral to first and last mile travel, better day-ahead planning supports user reliability goals and aligns with wider sustainability objectives. Guidance for bikeshare operations repeatedly highlights the importance of anticipating demand to guide rebalancing and service levels. </w:t>
+        <w:t xml:space="preserve">Daily forecasts help operators plan redistribution and maintenance on the right days, for example reducing unnecessary relocations on low-demand weather days, and improving availability when warm and dry conditions are expected. </w:t>
+      </w:r>
+      <w:r>
+        <w:t>In cycling cities, day-ahead planning improves reliability and supports sustainability goals.</w:t>
+      </w:r>
+      <w:r>
+        <w:t xml:space="preserve">. Guidance for bikeshare operations repeatedly highlights the importance of anticipating demand to guide rebalancing and service levels. </w:t>
       </w:r>
     </w:p>
     <w:p>
       <w:pPr>
         <w:pStyle w:val="Heading3"/>
       </w:pPr>
-      <w:r>
-        <w:t>1.3 Document scope statement</w:t>
-      </w:r>
+      <w:bookmarkStart w:id="3" w:name="_Toc212585488"/>
+      <w:r>
+        <w:t xml:space="preserve">1.3 </w:t>
+      </w:r>
+      <w:r>
+        <w:t>Document Purpose and Scope</w:t>
+      </w:r>
+      <w:bookmarkEnd w:id="3"/>
     </w:p>
     <w:p>
       <w:r>
@@ -156,429 +1898,24 @@
       <w:pPr>
         <w:pStyle w:val="Heading2"/>
       </w:pPr>
-      <w:r>
-        <w:lastRenderedPageBreak/>
+      <w:bookmarkStart w:id="4" w:name="_Toc212585489"/>
+      <w:r>
         <w:t>2. Explainable AI, What and Why</w:t>
       </w:r>
+      <w:bookmarkEnd w:id="4"/>
     </w:p>
     <w:p>
       <w:pPr>
         <w:pStyle w:val="Heading3"/>
       </w:pPr>
-      <w:r>
-        <w:t>2.1 Core definitions and concepts</w:t>
-      </w:r>
-    </w:p>
-    <w:p>
-      <w:pPr>
-        <w:pStyle w:val="Heading3"/>
-        <w:rPr>
-          <w:rFonts w:eastAsiaTheme="minorHAnsi" w:cstheme="minorBidi"/>
-          <w:color w:val="auto"/>
-          <w:sz w:val="24"/>
-          <w:szCs w:val="24"/>
-        </w:rPr>
-      </w:pPr>
-      <w:r>
-        <w:rPr>
-          <w:rFonts w:eastAsiaTheme="minorHAnsi" w:cstheme="minorBidi"/>
-          <w:color w:val="auto"/>
-          <w:sz w:val="24"/>
-          <w:szCs w:val="24"/>
-        </w:rPr>
-        <w:t>Explainable Artificial Intelligence means AI whose outputs can be understood by humans, with the literature distinguishing opaque systems that do not reveal how inputs become outputs, interpretable systems whose internal mapping can be analyzed, and comprehensible systems that provide human-readable cues users can reason with.</w:t>
-      </w:r>
-    </w:p>
-    <w:p>
-      <w:pPr>
-        <w:pStyle w:val="Heading3"/>
-      </w:pPr>
-      <w:r>
-        <w:t>2.2 Why explanations matter in public mobility</w:t>
-      </w:r>
-    </w:p>
-    <w:p>
-      <w:r>
-        <w:t xml:space="preserve">Forecasts influence resource allocation, maintenance scheduling, and rider experience, therefore stakeholders need clarity about which observed factors shaped a given daily prediction and why the outcome differs from typical conditions. </w:t>
-      </w:r>
-      <w:r>
-        <w:t>In European policy this aligns with Trustworthy AI guidance that emphasizes transparency and human oversight across the lifecycle, which, for this setting, means being clear about which factors shaped each day’s forecast and why it differs from typical conditions.</w:t>
-      </w:r>
-    </w:p>
-    <w:p>
-      <w:pPr>
-        <w:pStyle w:val="Heading3"/>
-      </w:pPr>
-      <w:r>
-        <w:t xml:space="preserve">2.3 </w:t>
-      </w:r>
-      <w:r>
-        <w:t>Three key principles often guide Explainable AI systems:</w:t>
-      </w:r>
-    </w:p>
-    <w:p>
-      <w:pPr>
-        <w:numPr>
-          <w:ilvl w:val="0"/>
-          <w:numId w:val="22"/>
-        </w:numPr>
-      </w:pPr>
-      <w:r>
-        <w:rPr>
-          <w:b/>
-          <w:bCs/>
-        </w:rPr>
-        <w:t>Transparency:</w:t>
-      </w:r>
-      <w:r>
-        <w:t xml:space="preserve"> The system should clearly show which factors influence its predictions and how those influences work.</w:t>
-      </w:r>
-    </w:p>
-    <w:p>
-      <w:pPr>
-        <w:numPr>
-          <w:ilvl w:val="0"/>
-          <w:numId w:val="22"/>
-        </w:numPr>
-      </w:pPr>
-      <w:r>
-        <w:rPr>
-          <w:b/>
-          <w:bCs/>
-        </w:rPr>
-        <w:t>Trustworthiness:</w:t>
-      </w:r>
-      <w:r>
-        <w:t xml:space="preserve"> Explanations should be consistent, verifiable, and based on real observations, allowing users to assess reliability.</w:t>
-      </w:r>
-    </w:p>
-    <w:p>
-      <w:pPr>
-        <w:numPr>
-          <w:ilvl w:val="0"/>
-          <w:numId w:val="22"/>
-        </w:numPr>
-      </w:pPr>
-      <w:r>
-        <w:rPr>
-          <w:b/>
-          <w:bCs/>
-        </w:rPr>
-        <w:t>Accountability:</w:t>
-      </w:r>
-      <w:r>
-        <w:t xml:space="preserve"> Assumptions, limitations, and decision impacts should be documented so outcomes can be reviewed and improved over time.</w:t>
-      </w:r>
-    </w:p>
-    <w:p>
-      <w:r>
-        <w:t xml:space="preserve">These principles are widely recognized in both research and European guidance on </w:t>
-      </w:r>
-      <w:r>
-        <w:rPr>
-          <w:b/>
-          <w:bCs/>
-        </w:rPr>
-        <w:t>Trustworthy AI</w:t>
-      </w:r>
-      <w:r>
-        <w:t>.</w:t>
-      </w:r>
-    </w:p>
-    <w:p/>
-    <w:p>
-      <w:pPr>
-        <w:pStyle w:val="Heading2"/>
-      </w:pPr>
-      <w:r>
-        <w:t>3. Domain Analysis</w:t>
-      </w:r>
-    </w:p>
-    <w:p>
-      <w:pPr>
-        <w:pStyle w:val="Heading3"/>
-      </w:pPr>
-      <w:r>
-        <w:t>3.1 Research question</w:t>
-      </w:r>
-    </w:p>
-    <w:p>
-      <w:r>
-        <w:rPr>
-          <w:b/>
-          <w:bCs/>
-        </w:rPr>
-        <w:t>Which observable factors influence the daily number of rentals in a city bikeshare system</w:t>
-      </w:r>
-      <w:r>
-        <w:rPr>
-          <w:b/>
-          <w:bCs/>
-        </w:rPr>
-        <w:t>?</w:t>
-      </w:r>
-      <w:r>
-        <w:br/>
-      </w:r>
-      <w:r>
-        <w:t>This question targets day-to-day variation rather than intraday patterns, because operators plan redistribution and maintenance on a daily cadence.</w:t>
-      </w:r>
-    </w:p>
-    <w:p>
-      <w:pPr>
-        <w:pStyle w:val="Heading3"/>
-      </w:pPr>
-      <w:r>
-        <w:t>3.2 What I do, planned analysis activities</w:t>
-      </w:r>
-    </w:p>
-    <w:p>
-      <w:r>
-        <w:t xml:space="preserve">This study synthesizes academic and practitioner evidence to identify measurable daily drivers of bike-rental demand, focusing on weather and calendar conditions that are </w:t>
-      </w:r>
-      <w:r>
-        <w:lastRenderedPageBreak/>
-        <w:t xml:space="preserve">observable before the operating day. </w:t>
-      </w:r>
-      <w:r>
-        <w:t>The analysis combines library research on cycling and bikeshare demand with practitioner guidance on system operations, then organizes drivers into weather and calendar categories to inform data requirements for a later modeling phase.</w:t>
-      </w:r>
-      <w:r>
-        <w:t xml:space="preserve"> </w:t>
-      </w:r>
-    </w:p>
-    <w:p>
-      <w:pPr>
-        <w:pStyle w:val="Heading3"/>
-      </w:pPr>
-      <w:r>
-        <w:t>3.3 Why I am doing this, problems and pain points</w:t>
-      </w:r>
-    </w:p>
-    <w:p>
-      <w:r>
-        <w:t>Operators face two recurring risks, empty stations that harm rider experience during peaks, and idle inventory that increases costs when demand drops. In a cycling-centric context like the Netherlands, even modest percentage shifts in daily cycling volumes can have visible operational consequences, which is why anticipating the influence of temperature, rain, wind, and seasonality is valuable for day-ahead planning. Planning guides emphasize that proactive use of demand expectations improves redistribution efficiency and service reliability.</w:t>
-      </w:r>
-      <w:r>
-        <w:t xml:space="preserve"> </w:t>
-      </w:r>
-    </w:p>
-    <w:p>
-      <w:pPr>
-        <w:pStyle w:val="Heading3"/>
-      </w:pPr>
-      <w:r>
-        <w:t>3.4 Observed factors and their daily effect on the target cnt</w:t>
-      </w:r>
-    </w:p>
-    <w:p>
-      <w:r>
-        <w:t>Evidence from Dutch and international studies shows consistent daily relationships between weather and cycling activity, higher temperatures and dry conditions are associated with more trips, while precipitation and strong winds correspond to fewer trips. Calendar structure also matters, seasons and months capture broad climatic cycles, while weekdays differentiate commute patterns from weekend leisure riding. These effects provide a defensible basis for constructing daily features that correspond to observable conditions prior to operations.</w:t>
-      </w:r>
-      <w:r>
-        <w:t xml:space="preserve"> </w:t>
-      </w:r>
-    </w:p>
-    <w:p>
-      <w:pPr>
-        <w:pStyle w:val="Heading4"/>
-      </w:pPr>
-      <w:r>
-        <w:t>3.4.1 Weather factors, temperature, precipitation, wind, humidity</w:t>
-      </w:r>
-    </w:p>
-    <w:p>
-      <w:r>
-        <w:t xml:space="preserve">Daily average or maximum </w:t>
-      </w:r>
-      <w:r>
-        <w:rPr>
-          <w:b/>
-          <w:bCs/>
-        </w:rPr>
-        <w:t>temperature</w:t>
-      </w:r>
-      <w:r>
-        <w:t xml:space="preserve"> is positively associated with cycling up to comfort limits, while </w:t>
-      </w:r>
-      <w:r>
-        <w:rPr>
-          <w:b/>
-          <w:bCs/>
-        </w:rPr>
-        <w:t>precipitation</w:t>
-      </w:r>
-      <w:r>
-        <w:t xml:space="preserve"> reduces usage with stronger effects on heavier rain or snow days. </w:t>
-      </w:r>
-      <w:r>
-        <w:rPr>
-          <w:b/>
-          <w:bCs/>
-        </w:rPr>
-        <w:t>Wind speed</w:t>
-      </w:r>
-      <w:r>
-        <w:t xml:space="preserve"> is typically negatively associated with cycling, and </w:t>
-      </w:r>
-      <w:r>
-        <w:rPr>
-          <w:b/>
-          <w:bCs/>
-        </w:rPr>
-        <w:t>humidity</w:t>
-      </w:r>
-      <w:r>
-        <w:t xml:space="preserve"> can interact with temperature and rainfall in shaping comfort. These variables are readily available from standard meteorological sources at a daily resolution, which aligns with the target definition in public datasets. </w:t>
-      </w:r>
-    </w:p>
-    <w:p>
-      <w:pPr>
-        <w:pStyle w:val="Heading4"/>
-      </w:pPr>
-      <w:r>
-        <w:t>3.4.2 Calendar factors, season, month, weekday, holidays and events</w:t>
-      </w:r>
-    </w:p>
-    <w:p>
-      <w:r>
-        <w:rPr>
-          <w:b/>
-          <w:bCs/>
-        </w:rPr>
-        <w:t>Season</w:t>
-      </w:r>
-      <w:r>
-        <w:t xml:space="preserve"> and </w:t>
-      </w:r>
-      <w:r>
-        <w:rPr>
-          <w:b/>
-          <w:bCs/>
-        </w:rPr>
-        <w:t>month</w:t>
-      </w:r>
-      <w:r>
-        <w:t xml:space="preserve"> capture climatic cycles and daylight variation relevant to Dutch conditions, while </w:t>
-      </w:r>
-      <w:r>
-        <w:rPr>
-          <w:b/>
-          <w:bCs/>
-        </w:rPr>
-        <w:t>weekday</w:t>
-      </w:r>
-      <w:r>
-        <w:t xml:space="preserve"> separates commute-oriented demand from weekend leisure patterns. </w:t>
-      </w:r>
-      <w:r>
-        <w:rPr>
-          <w:b/>
-          <w:bCs/>
-        </w:rPr>
-        <w:t>Holidays and large events</w:t>
-      </w:r>
-      <w:r>
-        <w:t xml:space="preserve"> can shift volumes away from typical weekday profiles, so daily holiday indicators and event flags are useful where available. These calendar variables are deterministic and easy to generate once the analysis period is defined.</w:t>
-      </w:r>
-      <w:r>
-        <w:t xml:space="preserve"> </w:t>
-      </w:r>
-    </w:p>
-    <w:p>
-      <w:pPr>
-        <w:pStyle w:val="Heading3"/>
-      </w:pPr>
-      <w:r>
-        <w:t>3.5 Interim summary of domain insights</w:t>
-      </w:r>
-    </w:p>
-    <w:p>
-      <w:r>
-        <w:t xml:space="preserve">At a daily horizon the most consistent observable drivers are weather and calendar structure, specifically temperature, precipitation, wind, season or month, weekday, </w:t>
-      </w:r>
-      <w:r>
-        <w:lastRenderedPageBreak/>
-        <w:t>and optional holiday or event indicators, which are measurable before operations begin and map directly to redistribution and maintenance decisions.</w:t>
-      </w:r>
-    </w:p>
-    <w:p>
-      <w:pPr>
-        <w:pStyle w:val="Heading2"/>
-      </w:pPr>
-      <w:r>
-        <w:t>4. Explainable AI in This Project, Stakeholders and Use Cases</w:t>
-      </w:r>
-    </w:p>
-    <w:p>
-      <w:pPr>
-        <w:pStyle w:val="Heading3"/>
-      </w:pPr>
-      <w:r>
-        <w:t>4.1 Company perspective, operations, planning, maintenance</w:t>
-      </w:r>
-    </w:p>
-    <w:p>
-      <w:pPr>
-        <w:pStyle w:val="Heading3"/>
-        <w:rPr>
-          <w:rFonts w:eastAsiaTheme="minorHAnsi" w:cstheme="minorBidi"/>
-          <w:color w:val="auto"/>
-          <w:sz w:val="24"/>
-          <w:szCs w:val="24"/>
-        </w:rPr>
-      </w:pPr>
-      <w:r>
-        <w:rPr>
-          <w:rFonts w:eastAsiaTheme="minorHAnsi" w:cstheme="minorBidi"/>
-          <w:color w:val="auto"/>
-          <w:sz w:val="24"/>
-          <w:szCs w:val="24"/>
-        </w:rPr>
-        <w:t>Daily forecasts support company teams in planning bike movements, staff allocation, and maintenance activities without reducing availability. Short factor summaries, for example expected temperature, precipitation, wind, season, and weekday, show why tomorrow may differ from a typical peer day and help improve redistribution planning, shift organization, and maintenance scheduling. Add brief what-if lines, for example how stronger rain or calmer wind would change expected demand, so planners can act proactively.</w:t>
-      </w:r>
-    </w:p>
-    <w:p>
-      <w:pPr>
-        <w:pStyle w:val="Heading3"/>
-      </w:pPr>
-      <w:r>
-        <w:t>4.2 Customer perspective, rider experience and communication</w:t>
-      </w:r>
-    </w:p>
-    <w:p>
-      <w:pPr>
-        <w:pStyle w:val="Heading3"/>
-        <w:rPr>
-          <w:rFonts w:eastAsiaTheme="minorHAnsi" w:cstheme="minorBidi"/>
-          <w:color w:val="auto"/>
-          <w:sz w:val="24"/>
-          <w:szCs w:val="24"/>
-        </w:rPr>
-      </w:pPr>
-      <w:r>
-        <w:rPr>
-          <w:rFonts w:eastAsiaTheme="minorHAnsi" w:cstheme="minorBidi"/>
-          <w:color w:val="auto"/>
-          <w:sz w:val="24"/>
-          <w:szCs w:val="24"/>
-        </w:rPr>
-        <w:t>Although this project does not directly communicate with riders, improved operational decisions enhance customer experience indirectly. Clear daily forecasts with factor summaries lead to more consistent availability, and later the same summaries could support user messages such as expected high-demand periods or suggested alternative stations.</w:t>
-      </w:r>
-    </w:p>
-    <w:p>
-      <w:pPr>
-        <w:pStyle w:val="Heading3"/>
-      </w:pPr>
-      <w:r>
-        <w:t>4.</w:t>
-      </w:r>
-      <w:r>
-        <w:t>3</w:t>
-      </w:r>
-      <w:r>
-        <w:t xml:space="preserve"> Trustworthy and transparent AI applied to decisions in this context</w:t>
-      </w:r>
+      <w:bookmarkStart w:id="5" w:name="_Toc212585490"/>
+      <w:r>
+        <w:t xml:space="preserve">2.1 </w:t>
+      </w:r>
+      <w:r>
+        <w:t>Core Definitions and Key Concepts</w:t>
+      </w:r>
+      <w:bookmarkEnd w:id="5"/>
     </w:p>
     <w:p>
       <w:pPr>
@@ -590,6 +1927,429 @@
         </w:rPr>
       </w:pPr>
       <w:r>
+        <w:t>Explainable Artificial Intelligence refers to systems whose outputs can be understood by humans, including opaque systems that hide their process, interpretable systems that can be analyzed, and comprehensible systems that present human-readable explanations.</w:t>
+      </w:r>
+    </w:p>
+    <w:p>
+      <w:pPr>
+        <w:pStyle w:val="Heading3"/>
+      </w:pPr>
+      <w:bookmarkStart w:id="6" w:name="_Toc212585491"/>
+      <w:r>
+        <w:lastRenderedPageBreak/>
+        <w:t xml:space="preserve">2.2 </w:t>
+      </w:r>
+      <w:r>
+        <w:t>Importance of Explainability in Public Mobility</w:t>
+      </w:r>
+      <w:bookmarkEnd w:id="6"/>
+    </w:p>
+    <w:p>
+      <w:r>
+        <w:t>Forecasts influence resource allocation, maintenance scheduling, and rider experience, so stakeholders need clarity about the factors shaping each daily prediction. This aligns with European Trustworthy AI principles emphasizing transparency and human oversight across the lifecycle</w:t>
+      </w:r>
+    </w:p>
+    <w:p>
+      <w:pPr>
+        <w:pStyle w:val="Heading3"/>
+      </w:pPr>
+      <w:bookmarkStart w:id="7" w:name="_Toc212585492"/>
+      <w:r>
+        <w:t xml:space="preserve">2.3 </w:t>
+      </w:r>
+      <w:r>
+        <w:t>Core Principles of Explainable AI</w:t>
+      </w:r>
+      <w:bookmarkEnd w:id="7"/>
+    </w:p>
+    <w:p>
+      <w:pPr>
+        <w:numPr>
+          <w:ilvl w:val="0"/>
+          <w:numId w:val="22"/>
+        </w:numPr>
+      </w:pPr>
+      <w:r>
+        <w:rPr>
+          <w:b/>
+          <w:bCs/>
+        </w:rPr>
+        <w:t>Transparency:</w:t>
+      </w:r>
+      <w:r>
+        <w:t xml:space="preserve"> The system should clearly show which factors influence its predictions and how those influences work.</w:t>
+      </w:r>
+    </w:p>
+    <w:p>
+      <w:pPr>
+        <w:numPr>
+          <w:ilvl w:val="0"/>
+          <w:numId w:val="22"/>
+        </w:numPr>
+      </w:pPr>
+      <w:r>
+        <w:rPr>
+          <w:b/>
+          <w:bCs/>
+        </w:rPr>
+        <w:t>Trustworthiness:</w:t>
+      </w:r>
+      <w:r>
+        <w:t xml:space="preserve"> Explanations should be consistent, verifiable, and based on real observations</w:t>
+      </w:r>
+      <w:r>
+        <w:t>.</w:t>
+      </w:r>
+    </w:p>
+    <w:p>
+      <w:pPr>
+        <w:numPr>
+          <w:ilvl w:val="0"/>
+          <w:numId w:val="22"/>
+        </w:numPr>
+      </w:pPr>
+      <w:r>
+        <w:rPr>
+          <w:b/>
+          <w:bCs/>
+        </w:rPr>
+        <w:t>Accountability:</w:t>
+      </w:r>
+      <w:r>
+        <w:t xml:space="preserve"> Assumptions, limitations, and decision impacts should be documented so outcomes can be reviewed and improved over time.</w:t>
+      </w:r>
+    </w:p>
+    <w:p>
+      <w:r>
+        <w:t xml:space="preserve">These principles are widely recognized in both research and European guidance on </w:t>
+      </w:r>
+      <w:r>
+        <w:rPr>
+          <w:b/>
+          <w:bCs/>
+        </w:rPr>
+        <w:t>Trustworthy AI</w:t>
+      </w:r>
+      <w:r>
+        <w:t>.</w:t>
+      </w:r>
+    </w:p>
+    <w:p/>
+    <w:p>
+      <w:pPr>
+        <w:pStyle w:val="Heading2"/>
+      </w:pPr>
+      <w:bookmarkStart w:id="8" w:name="_Toc212585493"/>
+      <w:r>
+        <w:t>3. Domain Analysis</w:t>
+      </w:r>
+      <w:bookmarkEnd w:id="8"/>
+    </w:p>
+    <w:p>
+      <w:pPr>
+        <w:pStyle w:val="Heading3"/>
+      </w:pPr>
+      <w:bookmarkStart w:id="9" w:name="_Toc212585494"/>
+      <w:r>
+        <w:t xml:space="preserve">3.1 Research </w:t>
+      </w:r>
+      <w:r>
+        <w:t>Q</w:t>
+      </w:r>
+      <w:r>
+        <w:t>uestion</w:t>
+      </w:r>
+      <w:bookmarkEnd w:id="9"/>
+    </w:p>
+    <w:p>
+      <w:r>
+        <w:rPr>
+          <w:b/>
+          <w:bCs/>
+        </w:rPr>
+        <w:t>Which observable factors influence the daily number of rentals in a city bikeshare system</w:t>
+      </w:r>
+      <w:r>
+        <w:rPr>
+          <w:b/>
+          <w:bCs/>
+        </w:rPr>
+        <w:t>?</w:t>
+      </w:r>
+      <w:r>
+        <w:br/>
+      </w:r>
+      <w:r>
+        <w:t>This question targets day-to-day variation rather than intraday patterns, because operators plan redistribution and maintenance on a daily cadence.</w:t>
+      </w:r>
+    </w:p>
+    <w:p>
+      <w:pPr>
+        <w:pStyle w:val="Heading3"/>
+      </w:pPr>
+      <w:bookmarkStart w:id="10" w:name="_Toc212585495"/>
+      <w:r>
+        <w:t xml:space="preserve">3.2 </w:t>
+      </w:r>
+      <w:r>
+        <w:t>Planned Analysis Activities</w:t>
+      </w:r>
+      <w:bookmarkEnd w:id="10"/>
+    </w:p>
+    <w:p>
+      <w:r>
+        <w:t>The analysis draws on academic studies and practitioner materials about cycling and bikeshare demand. It then groups the identified drivers into weather and calendar categories to guide data requirements for a later modeling phase.</w:t>
+      </w:r>
+    </w:p>
+    <w:p>
+      <w:pPr>
+        <w:pStyle w:val="Heading3"/>
+      </w:pPr>
+      <w:bookmarkStart w:id="11" w:name="_Toc212585496"/>
+      <w:r>
+        <w:t xml:space="preserve">3.3 </w:t>
+      </w:r>
+      <w:r>
+        <w:t>Problem Statement and Rationale</w:t>
+      </w:r>
+      <w:bookmarkEnd w:id="11"/>
+    </w:p>
+    <w:p>
+      <w:r>
+        <w:t>Operators face two recurring risks, empty stations that harm rider experience during peaks, and idle inventory that increases costs when demand drops. In a cycling-centric context like the Netherlands, even modest percentage shifts in daily cycling volumes can have visible operational consequences, which is why anticipating the influence of temperature, rain, wind, and seasonality is valuable for day-ahead planning. Planning guides emphasize that proactive use of demand expectations improves redistribution efficiency and service reliability.</w:t>
+      </w:r>
+      <w:r>
+        <w:t xml:space="preserve"> </w:t>
+      </w:r>
+    </w:p>
+    <w:p>
+      <w:pPr>
+        <w:pStyle w:val="Heading3"/>
+      </w:pPr>
+      <w:bookmarkStart w:id="12" w:name="_Toc212585497"/>
+      <w:r>
+        <w:lastRenderedPageBreak/>
+        <w:t xml:space="preserve">3.4 </w:t>
+      </w:r>
+      <w:r>
+        <w:t>Observed Factors Influencing Daily Rental Demand</w:t>
+      </w:r>
+      <w:bookmarkEnd w:id="12"/>
+    </w:p>
+    <w:p>
+      <w:r>
+        <w:t>Evidence from Dutch and international studies shows consistent daily relationships between weather and cycling activity, higher temperatures and dry conditions are associated with more trips, while precipitation and strong winds correspond to fewer trips. Calendar structure also matters, seasons and months capture broad climatic cycles, while weekdays differentiate commute patterns from weekend leisure riding. These effects provide a defensible basis for constructing daily features that correspond to observable conditions prior to operations.</w:t>
+      </w:r>
+      <w:r>
+        <w:t xml:space="preserve"> </w:t>
+      </w:r>
+    </w:p>
+    <w:p>
+      <w:pPr>
+        <w:pStyle w:val="Heading4"/>
+      </w:pPr>
+      <w:r>
+        <w:t xml:space="preserve">3.4.1 </w:t>
+      </w:r>
+      <w:r>
+        <w:t>Weather-Related Factors</w:t>
+      </w:r>
+    </w:p>
+    <w:p>
+      <w:r>
+        <w:t xml:space="preserve">Daily average or maximum </w:t>
+      </w:r>
+      <w:r>
+        <w:rPr>
+          <w:b/>
+          <w:bCs/>
+        </w:rPr>
+        <w:t>temperature</w:t>
+      </w:r>
+      <w:r>
+        <w:t xml:space="preserve"> is positively associated with cycling up to comfort limits, while </w:t>
+      </w:r>
+      <w:r>
+        <w:rPr>
+          <w:b/>
+          <w:bCs/>
+        </w:rPr>
+        <w:t>precipitation</w:t>
+      </w:r>
+      <w:r>
+        <w:t xml:space="preserve"> reduces usage with stronger effects on heavier rain or snow days. </w:t>
+      </w:r>
+      <w:r>
+        <w:rPr>
+          <w:b/>
+          <w:bCs/>
+        </w:rPr>
+        <w:t>Wind speed</w:t>
+      </w:r>
+      <w:r>
+        <w:t xml:space="preserve"> is typically negatively associated with cycling, and </w:t>
+      </w:r>
+      <w:r>
+        <w:rPr>
+          <w:b/>
+          <w:bCs/>
+        </w:rPr>
+        <w:t>humidity</w:t>
+      </w:r>
+      <w:r>
+        <w:t xml:space="preserve"> can interact with temperature and rainfall in shaping comfort. These variables are readily available from standard meteorological sources at a daily resolution, which aligns with the target definition in public datasets. </w:t>
+      </w:r>
+    </w:p>
+    <w:p>
+      <w:pPr>
+        <w:pStyle w:val="Heading4"/>
+      </w:pPr>
+      <w:r>
+        <w:t xml:space="preserve">3.4.2 </w:t>
+      </w:r>
+      <w:r>
+        <w:t>Calendar-Related Factors</w:t>
+      </w:r>
+    </w:p>
+    <w:p>
+      <w:r>
+        <w:rPr>
+          <w:b/>
+          <w:bCs/>
+        </w:rPr>
+        <w:t>Season</w:t>
+      </w:r>
+      <w:r>
+        <w:t xml:space="preserve"> and </w:t>
+      </w:r>
+      <w:r>
+        <w:rPr>
+          <w:b/>
+          <w:bCs/>
+        </w:rPr>
+        <w:t>month</w:t>
+      </w:r>
+      <w:r>
+        <w:t xml:space="preserve"> capture climatic cycles and daylight variation relevant to Dutch conditions, while </w:t>
+      </w:r>
+      <w:r>
+        <w:rPr>
+          <w:b/>
+          <w:bCs/>
+        </w:rPr>
+        <w:t>weekday</w:t>
+      </w:r>
+      <w:r>
+        <w:t xml:space="preserve"> separates commute-oriented demand from weekend leisure patterns. </w:t>
+      </w:r>
+      <w:r>
+        <w:rPr>
+          <w:b/>
+          <w:bCs/>
+        </w:rPr>
+        <w:t>Holidays and large events</w:t>
+      </w:r>
+      <w:r>
+        <w:t xml:space="preserve"> can shift volumes away from typical weekday profiles, so daily holiday indicators and event flags are useful where available. These calendar variables are deterministic and easy to generate once the analysis period is defined.</w:t>
+      </w:r>
+      <w:r>
+        <w:t xml:space="preserve"> </w:t>
+      </w:r>
+    </w:p>
+    <w:p>
+      <w:pPr>
+        <w:pStyle w:val="Heading3"/>
+      </w:pPr>
+      <w:bookmarkStart w:id="13" w:name="_Toc212585498"/>
+      <w:r>
+        <w:t xml:space="preserve">3.5 </w:t>
+      </w:r>
+      <w:r>
+        <w:t>Summary of Domain Insights</w:t>
+      </w:r>
+      <w:bookmarkEnd w:id="13"/>
+    </w:p>
+    <w:p>
+      <w:r>
+        <w:t>At a daily level, the most consistent observable drivers are weather and calendar factors such as temperature, precipitation, wind, season or month, weekday, and holiday or event indicators. These variables can be measured before operations begin and directly inform redistribution and maintenance decisions.</w:t>
+      </w:r>
+    </w:p>
+    <w:p>
+      <w:pPr>
+        <w:pStyle w:val="Heading2"/>
+      </w:pPr>
+      <w:bookmarkStart w:id="14" w:name="_Toc212585499"/>
+      <w:r>
+        <w:t>4. Explainable AI in This Project, Stakeholders and Use Cases</w:t>
+      </w:r>
+      <w:bookmarkEnd w:id="14"/>
+    </w:p>
+    <w:p>
+      <w:pPr>
+        <w:pStyle w:val="Heading3"/>
+      </w:pPr>
+      <w:bookmarkStart w:id="15" w:name="_Toc212585500"/>
+      <w:r>
+        <w:t xml:space="preserve">4.1 </w:t>
+      </w:r>
+      <w:r>
+        <w:t>Operational Perspective (Company Use Case)</w:t>
+      </w:r>
+      <w:bookmarkEnd w:id="15"/>
+    </w:p>
+    <w:p>
+      <w:r>
+        <w:t>Daily forecasts support company teams in planning bike movements, staff allocation, and maintenance activities without reducing availability. Short factor summaries, for example expected temperature, precipitation, wind, season, and weekday, show why tomorrow may differ from a typical peer day and help improve redistribution planning, shift organization, and maintenance scheduling. Add brief what-if lines, for example how stronger rain or calmer wind would change expected demand, so planners can act proactively.</w:t>
+      </w:r>
+    </w:p>
+    <w:p>
+      <w:pPr>
+        <w:pStyle w:val="Heading3"/>
+      </w:pPr>
+      <w:bookmarkStart w:id="16" w:name="_Toc212585501"/>
+      <w:r>
+        <w:lastRenderedPageBreak/>
+        <w:t xml:space="preserve">4.2 </w:t>
+      </w:r>
+      <w:r>
+        <w:t>Customer Perspective (Rider Experience)</w:t>
+      </w:r>
+      <w:bookmarkEnd w:id="16"/>
+    </w:p>
+    <w:p>
+      <w:r>
+        <w:t>Although this project does not directly communicate with riders, improved operational decisions enhance customer experience indirectly. Clear daily forecasts with factor summaries lead to more consistent availability, and later the same summaries could support user messages such as expected high-demand periods or suggested alternative stations.</w:t>
+      </w:r>
+    </w:p>
+    <w:p>
+      <w:pPr>
+        <w:pStyle w:val="Heading3"/>
+      </w:pPr>
+      <w:bookmarkStart w:id="17" w:name="_Toc212585502"/>
+      <w:r>
+        <w:t>4.</w:t>
+      </w:r>
+      <w:r>
+        <w:t>3</w:t>
+      </w:r>
+      <w:r>
+        <w:t xml:space="preserve"> Trustworthy and transparent AI applied to decisions in this context</w:t>
+      </w:r>
+      <w:bookmarkEnd w:id="17"/>
+      <w:r>
+        <w:t xml:space="preserve"> </w:t>
+      </w:r>
+    </w:p>
+    <w:p>
+      <w:pPr>
+        <w:rPr>
+          <w:rFonts w:eastAsiaTheme="majorEastAsia" w:cstheme="majorBidi"/>
+          <w:color w:val="0F4761" w:themeColor="accent1" w:themeShade="BF"/>
+          <w:sz w:val="28"/>
+          <w:szCs w:val="28"/>
+        </w:rPr>
+      </w:pPr>
+      <w:r>
         <w:t xml:space="preserve">This project does </w:t>
       </w:r>
       <w:r>
@@ -637,6 +2397,7 @@
       <w:pPr>
         <w:pStyle w:val="Heading2"/>
       </w:pPr>
+      <w:bookmarkStart w:id="18" w:name="_Toc212585503"/>
       <w:r>
         <w:t>5. Data Requirements</w:t>
       </w:r>
@@ -646,14 +2407,20 @@
       <w:r>
         <w:t xml:space="preserve"> Domain</w:t>
       </w:r>
+      <w:bookmarkEnd w:id="18"/>
     </w:p>
     <w:p>
       <w:pPr>
         <w:pStyle w:val="Heading3"/>
       </w:pPr>
-      <w:r>
-        <w:t>5.1 Target definition, daily total rentals</w:t>
-      </w:r>
+      <w:bookmarkStart w:id="19" w:name="_Toc212585504"/>
+      <w:r>
+        <w:t xml:space="preserve">5.1 </w:t>
+      </w:r>
+      <w:r>
+        <w:t>Target Definition: Daily Total Rentals</w:t>
+      </w:r>
+      <w:bookmarkEnd w:id="19"/>
     </w:p>
     <w:p>
       <w:r>
@@ -680,28 +2447,17 @@
       <w:pPr>
         <w:pStyle w:val="Heading3"/>
       </w:pPr>
-      <w:r>
-        <w:lastRenderedPageBreak/>
-        <w:t>5.2 Input variables, daily weather and calendar features, optional operational signals</w:t>
-      </w:r>
+      <w:bookmarkStart w:id="20" w:name="_Toc212585505"/>
+      <w:r>
+        <w:t xml:space="preserve">5.2 </w:t>
+      </w:r>
+      <w:r>
+        <w:t>Input Variables and Optional Operational Signals</w:t>
+      </w:r>
+      <w:bookmarkEnd w:id="20"/>
     </w:p>
     <w:p>
-      <w:pPr>
-        <w:pStyle w:val="Heading3"/>
-        <w:rPr>
-          <w:rFonts w:eastAsiaTheme="minorHAnsi" w:cstheme="minorBidi"/>
-          <w:color w:val="auto"/>
-          <w:sz w:val="24"/>
-          <w:szCs w:val="24"/>
-        </w:rPr>
-      </w:pPr>
-      <w:r>
-        <w:rPr>
-          <w:rFonts w:eastAsiaTheme="minorHAnsi" w:cstheme="minorBidi"/>
-          <w:color w:val="auto"/>
-          <w:sz w:val="24"/>
-          <w:szCs w:val="24"/>
-        </w:rPr>
+      <w:r>
         <w:t>Daily weather features such as temperature, rainfall, wind speed, and humidity are key factors that affect cycling activity and are available from national weather services. Calendar features like season, month, and weekday capture climate cycles and travel habits, while holiday or event flags explain unusual days. Optional operational data, such as available bikes, docks, or maintenance times, can help separate real demand changes from supply limits when available.</w:t>
       </w:r>
     </w:p>
@@ -709,9 +2465,14 @@
       <w:pPr>
         <w:pStyle w:val="Heading3"/>
       </w:pPr>
-      <w:r>
-        <w:t>5.3 Granularity and time span, daily aggregation and seasonal coverage</w:t>
-      </w:r>
+      <w:bookmarkStart w:id="21" w:name="_Toc212585506"/>
+      <w:r>
+        <w:t xml:space="preserve">5.3 </w:t>
+      </w:r>
+      <w:r>
+        <w:t>Granularity and Time Span</w:t>
+      </w:r>
+      <w:bookmarkEnd w:id="21"/>
     </w:p>
     <w:p>
       <w:r>
@@ -742,9 +2503,15 @@
       <w:pPr>
         <w:pStyle w:val="Heading3"/>
       </w:pPr>
-      <w:r>
-        <w:t>5.4 Data quality and governance, units, missing values</w:t>
-      </w:r>
+      <w:bookmarkStart w:id="22" w:name="_Toc212585507"/>
+      <w:r>
+        <w:lastRenderedPageBreak/>
+        <w:t xml:space="preserve">5.4 </w:t>
+      </w:r>
+      <w:r>
+        <w:t>Data Quality and Governance</w:t>
+      </w:r>
+      <w:bookmarkEnd w:id="22"/>
     </w:p>
     <w:p>
       <w:r>
@@ -775,9 +2542,14 @@
       <w:pPr>
         <w:pStyle w:val="Heading3"/>
       </w:pPr>
-      <w:r>
-        <w:t>5.5 Candidate data sources, to be confirmed later</w:t>
-      </w:r>
+      <w:bookmarkStart w:id="23" w:name="_Toc212585508"/>
+      <w:r>
+        <w:t xml:space="preserve">5.5 </w:t>
+      </w:r>
+      <w:r>
+        <w:t>Candidate Data Sources</w:t>
+      </w:r>
+      <w:bookmarkEnd w:id="23"/>
     </w:p>
     <w:p>
       <w:pPr>
@@ -865,59 +2637,35 @@
       <w:pPr>
         <w:pStyle w:val="Heading2"/>
       </w:pPr>
-      <w:r>
-        <w:t>6. Research Methodology Note, DOT Framework</w:t>
-      </w:r>
+      <w:bookmarkStart w:id="24" w:name="_Toc212585509"/>
+      <w:r>
+        <w:t xml:space="preserve">6. </w:t>
+      </w:r>
+      <w:r>
+        <w:t>Research Methodology: DOT Framework</w:t>
+      </w:r>
+      <w:r>
+        <w:t>y</w:t>
+      </w:r>
+      <w:bookmarkEnd w:id="24"/>
     </w:p>
     <w:p>
       <w:r>
-        <w:t xml:space="preserve">In this study, I used the Development Oriented Triangulation (DOT) Framework to guide my research through three strategies. I conducted </w:t>
-      </w:r>
-      <w:r>
-        <w:rPr>
-          <w:b/>
-          <w:bCs/>
-        </w:rPr>
-        <w:t>library research</w:t>
-      </w:r>
-      <w:r>
-        <w:t xml:space="preserve"> to review academic </w:t>
-      </w:r>
-      <w:r>
-        <w:lastRenderedPageBreak/>
-        <w:t xml:space="preserve">and practitioner sources on bike-rental forecasting and Explainable AI, ensuring a strong theoretical foundation. I carried out a </w:t>
-      </w:r>
-      <w:r>
-        <w:rPr>
-          <w:b/>
-          <w:bCs/>
-        </w:rPr>
-        <w:t>community scan</w:t>
-      </w:r>
-      <w:r>
-        <w:t xml:space="preserve"> to gather insights from developer and operator discussions, helping identify real operational challenges and practical variables. Finally, I used </w:t>
-      </w:r>
-      <w:r>
-        <w:rPr>
-          <w:b/>
-          <w:bCs/>
-        </w:rPr>
-        <w:t>showroom validation</w:t>
-      </w:r>
-      <w:r>
-        <w:t xml:space="preserve"> by comparing my findings with public reports from Dutch operators to confirm their relevance and alignment with real-world practices. This combination ensured that my work was both evidence-based and grounded in practice.</w:t>
+        <w:t>This study follows the Development Oriented Triangulation (DOT) Framework through two strategies. I conducted library research to review academic and practitioner sources on bike-rental forecasting and Explainable AI, ensuring a solid theoretical foundation. I also carried out a community scan to gather insights from developer and operator discussions, identifying real operational challenges and practical variables. This combination ensures that the work remains both evidence-based and grounded in practice.</w:t>
       </w:r>
     </w:p>
     <w:p>
       <w:pPr>
         <w:pStyle w:val="Heading2"/>
       </w:pPr>
+      <w:bookmarkStart w:id="25" w:name="_Toc212585510"/>
       <w:r>
         <w:t xml:space="preserve">7. </w:t>
       </w:r>
       <w:r>
         <w:t>References and Resources</w:t>
       </w:r>
+      <w:bookmarkEnd w:id="25"/>
     </w:p>
     <w:p>
       <w:pPr>
@@ -1047,6 +2795,7 @@
         </w:numPr>
       </w:pPr>
       <w:r>
+        <w:lastRenderedPageBreak/>
         <w:t xml:space="preserve">UCI Machine Learning Repository. </w:t>
       </w:r>
       <w:r>
@@ -1384,7 +3133,6 @@
         </w:numPr>
       </w:pPr>
       <w:r>
-        <w:lastRenderedPageBreak/>
         <w:t xml:space="preserve">SpringerLink — transportation research used for Dutch cycling demand studies. </w:t>
       </w:r>
       <w:r>
@@ -5200,6 +6948,7 @@
   <w:style w:type="character" w:default="1" w:styleId="DefaultParagraphFont">
     <w:name w:val="Default Paragraph Font"/>
     <w:uiPriority w:val="1"/>
+    <w:semiHidden/>
     <w:unhideWhenUsed/>
   </w:style>
   <w:style w:type="table" w:default="1" w:styleId="TableNormal">

</xml_diff>